<commit_message>
docs: add equations to demo example
</commit_message>
<xml_diff>
--- a/examples/demo_word.docx
+++ b/examples/demo_word.docx
@@ -288,7 +288,325 @@
       </w:r>
     </w:p>
     <w:bookmarkEnd w:id="23"/>
-    <w:bookmarkStart w:id="25" w:name="formatting"/>
+    <w:bookmarkStart w:id="24" w:name="equations"/>
+    <w:p>
+      <w:pPr>
+        <w:pStyle w:val="Heading1"/>
+      </w:pPr>
+      <w:r>
+        <w:t xml:space="preserve">Equations</w:t>
+      </w:r>
+    </w:p>
+    <w:p>
+      <w:pPr>
+        <w:pStyle w:val="FirstParagraph"/>
+      </w:pPr>
+      <w:r>
+        <w:t xml:space="preserve">Standard LaTeX math environments are fully supported and converted seamlessly into Word equations.</w:t>
+      </w:r>
+    </w:p>
+    <w:p>
+      <w:pPr>
+        <w:pStyle w:val="BodyText"/>
+      </w:pPr>
+      <w:r>
+        <w:t xml:space="preserve">Here is an inline equation:</w:t>
+      </w:r>
+      <w:r>
+        <w:t xml:space="preserve"> </w:t>
+      </w:r>
+      <m:oMath>
+        <m:r>
+          <m:t>E</m:t>
+        </m:r>
+        <m:r>
+          <m:rPr>
+            <m:sty m:val="p"/>
+          </m:rPr>
+          <m:t>=</m:t>
+        </m:r>
+        <m:r>
+          <m:t>m</m:t>
+        </m:r>
+        <m:sSup>
+          <m:e>
+            <m:r>
+              <m:t>c</m:t>
+            </m:r>
+          </m:e>
+          <m:sup>
+            <m:r>
+              <m:t>2</m:t>
+            </m:r>
+          </m:sup>
+        </m:sSup>
+      </m:oMath>
+      <w:r>
+        <w:t xml:space="preserve">. And here is a block equation:</w:t>
+      </w:r>
+    </w:p>
+    <w:p>
+      <w:pPr>
+        <w:pStyle w:val="BodyText"/>
+      </w:pPr>
+      <m:oMathPara>
+        <m:oMathParaPr>
+          <m:jc m:val="center"/>
+        </m:oMathParaPr>
+        <m:oMath>
+          <m:r>
+            <m:t>f</m:t>
+          </m:r>
+          <m:r>
+            <m:rPr>
+              <m:sty m:val="p"/>
+            </m:rPr>
+            <m:t>(</m:t>
+          </m:r>
+          <m:r>
+            <m:t>x</m:t>
+          </m:r>
+          <m:r>
+            <m:rPr>
+              <m:sty m:val="p"/>
+            </m:rPr>
+            <m:t>)</m:t>
+          </m:r>
+          <m:r>
+            <m:rPr>
+              <m:sty m:val="p"/>
+            </m:rPr>
+            <m:t>=</m:t>
+          </m:r>
+          <m:nary>
+            <m:naryPr>
+              <m:chr m:val="∫"/>
+              <m:limLoc m:val="subSup"/>
+              <m:subHide m:val="off"/>
+              <m:supHide m:val="off"/>
+            </m:naryPr>
+            <m:sub>
+              <m:r>
+                <m:rPr>
+                  <m:sty m:val="p"/>
+                </m:rPr>
+                <m:t>−</m:t>
+              </m:r>
+              <m:r>
+                <m:rPr>
+                  <m:sty m:val="p"/>
+                </m:rPr>
+                <m:t>∞</m:t>
+              </m:r>
+            </m:sub>
+            <m:sup>
+              <m:r>
+                <m:rPr>
+                  <m:sty m:val="p"/>
+                </m:rPr>
+                <m:t>∞</m:t>
+              </m:r>
+            </m:sup>
+            <m:e>
+              <m:acc>
+                <m:accPr>
+                  <m:chr m:val="̂"/>
+                </m:accPr>
+                <m:e>
+                  <m:r>
+                    <m:t>f</m:t>
+                  </m:r>
+                </m:e>
+              </m:acc>
+            </m:e>
+          </m:nary>
+          <m:r>
+            <m:rPr>
+              <m:sty m:val="p"/>
+            </m:rPr>
+            <m:t>(</m:t>
+          </m:r>
+          <m:r>
+            <m:t>ξ</m:t>
+          </m:r>
+          <m:r>
+            <m:rPr>
+              <m:sty m:val="p"/>
+            </m:rPr>
+            <m:t>)</m:t>
+          </m:r>
+          <m:r>
+            <m:t> </m:t>
+          </m:r>
+          <m:sSup>
+            <m:e>
+              <m:r>
+                <m:t>e</m:t>
+              </m:r>
+            </m:e>
+            <m:sup>
+              <m:r>
+                <m:t>2</m:t>
+              </m:r>
+              <m:r>
+                <m:t>π</m:t>
+              </m:r>
+              <m:r>
+                <m:t>i</m:t>
+              </m:r>
+              <m:r>
+                <m:t>ξ</m:t>
+              </m:r>
+              <m:r>
+                <m:t>x</m:t>
+              </m:r>
+            </m:sup>
+          </m:sSup>
+          <m:r>
+            <m:t> </m:t>
+          </m:r>
+          <m:r>
+            <m:t>d</m:t>
+          </m:r>
+          <m:r>
+            <m:t>ξ</m:t>
+          </m:r>
+        </m:oMath>
+      </m:oMathPara>
+    </w:p>
+    <w:p>
+      <w:pPr>
+        <w:pStyle w:val="FirstParagraph"/>
+      </w:pPr>
+      <w:r>
+        <w:t xml:space="preserve">You can also use aligned equations:</w:t>
+      </w:r>
+    </w:p>
+    <w:p>
+      <w:pPr>
+        <w:pStyle w:val="BodyText"/>
+      </w:pPr>
+      <m:oMathPara>
+        <m:oMathParaPr>
+          <m:jc m:val="center"/>
+        </m:oMathParaPr>
+        <m:oMath>
+          <m:eqArr>
+            <m:e>
+              <m:sSup>
+                <m:e>
+                  <m:r>
+                    <m:t>a</m:t>
+                  </m:r>
+                </m:e>
+                <m:sup>
+                  <m:r>
+                    <m:t>2</m:t>
+                  </m:r>
+                </m:sup>
+              </m:sSup>
+              <m:r>
+                <m:rPr>
+                  <m:sty m:val="p"/>
+                </m:rPr>
+                <m:t>+</m:t>
+              </m:r>
+              <m:sSup>
+                <m:e>
+                  <m:r>
+                    <m:t>b</m:t>
+                  </m:r>
+                </m:e>
+                <m:sup>
+                  <m:r>
+                    <m:t>2</m:t>
+                  </m:r>
+                </m:sup>
+              </m:sSup>
+              <m:r>
+                <m:t>&amp;</m:t>
+              </m:r>
+              <m:r>
+                <m:rPr>
+                  <m:sty m:val="p"/>
+                </m:rPr>
+                <m:t>=</m:t>
+              </m:r>
+              <m:sSup>
+                <m:e>
+                  <m:r>
+                    <m:t>c</m:t>
+                  </m:r>
+                </m:e>
+                <m:sup>
+                  <m:r>
+                    <m:t>2</m:t>
+                  </m:r>
+                </m:sup>
+              </m:sSup>
+            </m:e>
+            <m:e>
+              <m:sSup>
+                <m:e>
+                  <m:r>
+                    <m:rPr>
+                      <m:sty m:val="p"/>
+                    </m:rPr>
+                    <m:t>sin</m:t>
+                  </m:r>
+                </m:e>
+                <m:sup>
+                  <m:r>
+                    <m:t>2</m:t>
+                  </m:r>
+                </m:sup>
+              </m:sSup>
+              <m:r>
+                <m:t>θ</m:t>
+              </m:r>
+              <m:r>
+                <m:rPr>
+                  <m:sty m:val="p"/>
+                </m:rPr>
+                <m:t>+</m:t>
+              </m:r>
+              <m:sSup>
+                <m:e>
+                  <m:r>
+                    <m:rPr>
+                      <m:sty m:val="p"/>
+                    </m:rPr>
+                    <m:t>cos</m:t>
+                  </m:r>
+                </m:e>
+                <m:sup>
+                  <m:r>
+                    <m:t>2</m:t>
+                  </m:r>
+                </m:sup>
+              </m:sSup>
+              <m:r>
+                <m:t>θ</m:t>
+              </m:r>
+              <m:r>
+                <m:t>&amp;</m:t>
+              </m:r>
+              <m:r>
+                <m:rPr>
+                  <m:sty m:val="p"/>
+                </m:rPr>
+                <m:t>=</m:t>
+              </m:r>
+              <m:r>
+                <m:t>1</m:t>
+              </m:r>
+            </m:e>
+          </m:eqArr>
+        </m:oMath>
+      </m:oMathPara>
+    </w:p>
+    <w:bookmarkEnd w:id="24"/>
+    <w:bookmarkStart w:id="26" w:name="formatting"/>
     <w:p>
       <w:pPr>
         <w:pStyle w:val="Heading1"/>
@@ -360,7 +678,7 @@
       <w:r>
         <w:t xml:space="preserve"> </w:t>
       </w:r>
-      <w:hyperlink r:id="rId24">
+      <w:hyperlink r:id="rId25">
         <w:r>
           <w:rPr>
             <w:rStyle w:val="Hyperlink"/>
@@ -372,8 +690,8 @@
         <w:t xml:space="preserve">.</w:t>
       </w:r>
     </w:p>
-    <w:bookmarkEnd w:id="25"/>
-    <w:bookmarkStart w:id="26" w:name="conclusion"/>
+    <w:bookmarkEnd w:id="26"/>
+    <w:bookmarkStart w:id="27" w:name="conclusion"/>
     <w:p>
       <w:pPr>
         <w:pStyle w:val="Heading1"/>
@@ -396,8 +714,8 @@
         <w:t xml:space="preserve">.</w:t>
       </w:r>
     </w:p>
-    <w:bookmarkEnd w:id="26"/>
-    <w:bookmarkStart w:id="27" w:name="referencias"/>
+    <w:bookmarkEnd w:id="27"/>
+    <w:bookmarkStart w:id="28" w:name="referencias"/>
     <w:p>
       <w:pPr>
         <w:pStyle w:val="Heading1"/>
@@ -464,7 +782,7 @@
         <w:t xml:space="preserve">. Addison-Wesley, 2nd Edition, 2004.</w:t>
       </w:r>
     </w:p>
-    <w:bookmarkEnd w:id="27"/>
+    <w:bookmarkEnd w:id="28"/>
     <w:sectPr>
       <w:footnotePr>
         <w:numRestart w:val="eachSect"/>

</xml_diff>

<commit_message>
fix: remove title/author/date from preamble to prevent pandoc from generating text over the cover image
</commit_message>
<xml_diff>
--- a/examples/demo_word.docx
+++ b/examples/demo_word.docx
@@ -2,30 +2,6 @@
 <file path=word/document.xml><?xml version="1.0" encoding="utf-8"?>
 <w:document xmlns:w="http://schemas.openxmlformats.org/wordprocessingml/2006/main" xmlns:m="http://schemas.openxmlformats.org/officeDocument/2006/math" xmlns:r="http://schemas.openxmlformats.org/officeDocument/2006/relationships" xmlns:o="urn:schemas-microsoft-com:office:office" xmlns:v="urn:schemas-microsoft-com:vml" xmlns:w10="urn:schemas-microsoft-com:office:word" xmlns:a="http://schemas.openxmlformats.org/drawingml/2006/main" xmlns:pic="http://schemas.openxmlformats.org/drawingml/2006/picture" xmlns:wp="http://schemas.openxmlformats.org/drawingml/2006/wordprocessingDrawing">
   <w:body>
-    <w:p>
-      <w:pPr>
-        <w:pStyle w:val="Title"/>
-      </w:pPr>
-      <w:r>
-        <w:t xml:space="preserve">tex2docx Demo Document</w:t>
-      </w:r>
-    </w:p>
-    <w:p>
-      <w:pPr>
-        <w:pStyle w:val="Author"/>
-      </w:pPr>
-      <w:r>
-        <w:t xml:space="preserve">tex2docx Project</w:t>
-      </w:r>
-    </w:p>
-    <w:p>
-      <w:pPr>
-        <w:pStyle w:val="Date"/>
-      </w:pPr>
-      <w:r>
-        <w:t xml:space="preserve">2026-04-30</w:t>
-      </w:r>
-    </w:p>
     <w:p>
       <w:pPr>
         <w:pStyle w:val="Figure"/>

</xml_diff>

<commit_message>
chore: add example output files and temporary document for testing
</commit_message>
<xml_diff>
--- a/examples/demo_word.docx
+++ b/examples/demo_word.docx
@@ -9,20 +9,20 @@
       <w:r>
         <w:drawing>
           <wp:inline>
-            <wp:extent cx="5334000" cy="6902823"/>
+            <wp:extent cx="5753100" cy="7445188"/>
             <wp:effectExtent b="0" l="0" r="0" t="0"/>
-            <wp:docPr descr="" title="" id="10" name="Picture"/>
+            <wp:docPr descr="" title="" id="27" name="Picture"/>
             <a:graphic>
               <a:graphicData uri="http://schemas.openxmlformats.org/drawingml/2006/picture">
                 <pic:pic>
                   <pic:nvPicPr>
-                    <pic:cNvPr descr="tikz_png/page_portada.png" id="11" name="Picture"/>
+                    <pic:cNvPr descr="tikz_png/page_portada.png" id="28" name="Picture"/>
                     <pic:cNvPicPr>
                       <a:picLocks noChangeArrowheads="1" noChangeAspect="1"/>
                     </pic:cNvPicPr>
                   </pic:nvPicPr>
                   <pic:blipFill>
-                    <a:blip r:embed="rId9"/>
+                    <a:blip r:embed="rId26"/>
                     <a:stretch>
                       <a:fillRect/>
                     </a:stretch>
@@ -30,7 +30,7 @@
                   <pic:spPr bwMode="auto">
                     <a:xfrm>
                       <a:off x="0" y="0"/>
-                      <a:ext cx="5334000" cy="6902823"/>
+                      <a:ext cx="5753100" cy="7445188"/>
                     </a:xfrm>
                     <a:prstGeom prst="rect">
                       <a:avLst/>
@@ -56,20 +56,20 @@
       <w:r>
         <w:drawing>
           <wp:inline>
-            <wp:extent cx="5334000" cy="6902823"/>
+            <wp:extent cx="5753100" cy="7445188"/>
             <wp:effectExtent b="0" l="0" r="0" t="0"/>
-            <wp:docPr descr="" title="" id="13" name="Picture"/>
+            <wp:docPr descr="" title="" id="30" name="Picture"/>
             <a:graphic>
               <a:graphicData uri="http://schemas.openxmlformats.org/drawingml/2006/picture">
                 <pic:pic>
                   <pic:nvPicPr>
-                    <pic:cNvPr descr="tikz_png/page_indice.png" id="14" name="Picture"/>
+                    <pic:cNvPr descr="tikz_png/page_indice.png" id="31" name="Picture"/>
                     <pic:cNvPicPr>
                       <a:picLocks noChangeArrowheads="1" noChangeAspect="1"/>
                     </pic:cNvPicPr>
                   </pic:nvPicPr>
                   <pic:blipFill>
-                    <a:blip r:embed="rId12"/>
+                    <a:blip r:embed="rId29"/>
                     <a:stretch>
                       <a:fillRect/>
                     </a:stretch>
@@ -77,7 +77,7 @@
                   <pic:spPr bwMode="auto">
                     <a:xfrm>
                       <a:off x="0" y="0"/>
-                      <a:ext cx="5334000" cy="6902823"/>
+                      <a:ext cx="5753100" cy="7445188"/>
                     </a:xfrm>
                     <a:prstGeom prst="rect">
                       <a:avLst/>
@@ -103,20 +103,20 @@
       <w:r>
         <w:drawing>
           <wp:inline>
-            <wp:extent cx="5334000" cy="6902823"/>
+            <wp:extent cx="5753100" cy="7445188"/>
             <wp:effectExtent b="0" l="0" r="0" t="0"/>
-            <wp:docPr descr="" title="" id="16" name="Picture"/>
+            <wp:docPr descr="" title="" id="33" name="Picture"/>
             <a:graphic>
               <a:graphicData uri="http://schemas.openxmlformats.org/drawingml/2006/picture">
                 <pic:pic>
                   <pic:nvPicPr>
-                    <pic:cNvPr descr="tikz_png/page_glosario.png" id="17" name="Picture"/>
+                    <pic:cNvPr descr="tikz_png/page_glosario.png" id="34" name="Picture"/>
                     <pic:cNvPicPr>
                       <a:picLocks noChangeArrowheads="1" noChangeAspect="1"/>
                     </pic:cNvPicPr>
                   </pic:nvPicPr>
                   <pic:blipFill>
-                    <a:blip r:embed="rId15"/>
+                    <a:blip r:embed="rId32"/>
                     <a:stretch>
                       <a:fillRect/>
                     </a:stretch>
@@ -124,7 +124,7 @@
                   <pic:spPr bwMode="auto">
                     <a:xfrm>
                       <a:off x="0" y="0"/>
-                      <a:ext cx="5334000" cy="6902823"/>
+                      <a:ext cx="5753100" cy="7445188"/>
                     </a:xfrm>
                     <a:prstGeom prst="rect">
                       <a:avLst/>
@@ -143,11 +143,20 @@
         </w:drawing>
       </w:r>
     </w:p>
-    <w:bookmarkStart w:id="19" w:name="introduction"/>
+    <w:bookmarkStart w:id="36" w:name="introduction"/>
     <w:p>
       <w:pPr>
-        <w:pStyle w:val="Heading1"/>
-      </w:pPr>
+        <w:pStyle w:val="1"/>
+      </w:pPr>
+      <w:r>
+        <w:rPr>
+          <w:rStyle w:val="SectionNumber"/>
+        </w:rPr>
+        <w:t xml:space="preserve">1</w:t>
+      </w:r>
+      <w:r>
+        <w:tab/>
+      </w:r>
       <w:r>
         <w:t xml:space="preserve">Introduction</w:t>
       </w:r>
@@ -172,11 +181,20 @@
         <w:t xml:space="preserve">. It includes a title page, table of contents, acronyms, TikZ figures, and a bibliography.</w:t>
       </w:r>
     </w:p>
-    <w:bookmarkStart w:id="18" w:name="acronyms"/>
+    <w:bookmarkStart w:id="35" w:name="acronyms"/>
     <w:p>
       <w:pPr>
-        <w:pStyle w:val="Heading2"/>
-      </w:pPr>
+        <w:pStyle w:val="2"/>
+      </w:pPr>
+      <w:r>
+        <w:rPr>
+          <w:rStyle w:val="SectionNumber"/>
+        </w:rPr>
+        <w:t xml:space="preserve">1.1</w:t>
+      </w:r>
+      <w:r>
+        <w:tab/>
+      </w:r>
       <w:r>
         <w:t xml:space="preserve">Acronyms</w:t>
       </w:r>
@@ -189,13 +207,22 @@
         <w:t xml:space="preserve">Here we use some acronyms. The API allows different software components to communicate. Users interact with the system through the GUI. We can also use plural forms like APIs.</w:t>
       </w:r>
     </w:p>
-    <w:bookmarkEnd w:id="18"/>
-    <w:bookmarkEnd w:id="19"/>
-    <w:bookmarkStart w:id="23" w:name="tikz-diagrams"/>
+    <w:bookmarkEnd w:id="35"/>
+    <w:bookmarkEnd w:id="36"/>
+    <w:bookmarkStart w:id="40" w:name="tikz-diagrams"/>
     <w:p>
       <w:pPr>
-        <w:pStyle w:val="Heading1"/>
-      </w:pPr>
+        <w:pStyle w:val="1"/>
+      </w:pPr>
+      <w:r>
+        <w:rPr>
+          <w:rStyle w:val="SectionNumber"/>
+        </w:rPr>
+        <w:t xml:space="preserve">2</w:t>
+      </w:r>
+      <w:r>
+        <w:tab/>
+      </w:r>
       <w:r>
         <w:t xml:space="preserve">TikZ Diagrams</w:t>
       </w:r>
@@ -217,18 +244,18 @@
           <wp:inline>
             <wp:extent cx="3039844" cy="513776"/>
             <wp:effectExtent b="0" l="0" r="0" t="0"/>
-            <wp:docPr descr="" title="" id="21" name="Picture"/>
+            <wp:docPr descr="" title="" id="38" name="Picture"/>
             <a:graphic>
               <a:graphicData uri="http://schemas.openxmlformats.org/drawingml/2006/picture">
                 <pic:pic>
                   <pic:nvPicPr>
-                    <pic:cNvPr descr="tikz_png/fig_1.png" id="22" name="Picture"/>
+                    <pic:cNvPr descr="tikz_png/fig_1.png" id="39" name="Picture"/>
                     <pic:cNvPicPr>
                       <a:picLocks noChangeArrowheads="1" noChangeAspect="1"/>
                     </pic:cNvPicPr>
                   </pic:nvPicPr>
                   <pic:blipFill>
-                    <a:blip r:embed="rId20"/>
+                    <a:blip r:embed="rId37"/>
                     <a:stretch>
                       <a:fillRect/>
                     </a:stretch>
@@ -263,12 +290,21 @@
         <w:t xml:space="preserve">A simple process diagram.</w:t>
       </w:r>
     </w:p>
-    <w:bookmarkEnd w:id="23"/>
-    <w:bookmarkStart w:id="24" w:name="equations"/>
+    <w:bookmarkEnd w:id="40"/>
+    <w:bookmarkStart w:id="41" w:name="equations"/>
     <w:p>
       <w:pPr>
-        <w:pStyle w:val="Heading1"/>
-      </w:pPr>
+        <w:pStyle w:val="1"/>
+      </w:pPr>
+      <w:r>
+        <w:rPr>
+          <w:rStyle w:val="SectionNumber"/>
+        </w:rPr>
+        <w:t xml:space="preserve">3</w:t>
+      </w:r>
+      <w:r>
+        <w:tab/>
+      </w:r>
       <w:r>
         <w:t xml:space="preserve">Equations</w:t>
       </w:r>
@@ -581,12 +617,21 @@
         </m:oMath>
       </m:oMathPara>
     </w:p>
-    <w:bookmarkEnd w:id="24"/>
-    <w:bookmarkStart w:id="26" w:name="formatting"/>
+    <w:bookmarkEnd w:id="41"/>
+    <w:bookmarkStart w:id="43" w:name="formatting"/>
     <w:p>
       <w:pPr>
-        <w:pStyle w:val="Heading1"/>
-      </w:pPr>
+        <w:pStyle w:val="1"/>
+      </w:pPr>
+      <w:r>
+        <w:rPr>
+          <w:rStyle w:val="SectionNumber"/>
+        </w:rPr>
+        <w:t xml:space="preserve">4</w:t>
+      </w:r>
+      <w:r>
+        <w:tab/>
+      </w:r>
       <w:r>
         <w:t xml:space="preserve">Formatting</w:t>
       </w:r>
@@ -654,7 +699,7 @@
       <w:r>
         <w:t xml:space="preserve"> </w:t>
       </w:r>
-      <w:hyperlink r:id="rId25">
+      <w:hyperlink r:id="rId42">
         <w:r>
           <w:rPr>
             <w:rStyle w:val="Hyperlink"/>
@@ -666,12 +711,21 @@
         <w:t xml:space="preserve">.</w:t>
       </w:r>
     </w:p>
-    <w:bookmarkEnd w:id="26"/>
-    <w:bookmarkStart w:id="27" w:name="conclusion"/>
+    <w:bookmarkEnd w:id="43"/>
+    <w:bookmarkStart w:id="44" w:name="conclusion"/>
     <w:p>
       <w:pPr>
-        <w:pStyle w:val="Heading1"/>
-      </w:pPr>
+        <w:pStyle w:val="1"/>
+      </w:pPr>
+      <w:r>
+        <w:rPr>
+          <w:rStyle w:val="SectionNumber"/>
+        </w:rPr>
+        <w:t xml:space="preserve">5</w:t>
+      </w:r>
+      <w:r>
+        <w:tab/>
+      </w:r>
       <w:r>
         <w:t xml:space="preserve">Conclusion</w:t>
       </w:r>
@@ -690,11 +744,11 @@
         <w:t xml:space="preserve">.</w:t>
       </w:r>
     </w:p>
-    <w:bookmarkEnd w:id="27"/>
-    <w:bookmarkStart w:id="28" w:name="referencias"/>
+    <w:bookmarkEnd w:id="44"/>
+    <w:bookmarkStart w:id="45" w:name="referencias"/>
     <w:p>
       <w:pPr>
-        <w:pStyle w:val="Heading1"/>
+        <w:pStyle w:val="1"/>
       </w:pPr>
       <w:r>
         <w:t xml:space="preserve">Referencias</w:t>
@@ -758,11 +812,19 @@
         <w:t xml:space="preserve">. Addison-Wesley, 2nd Edition, 2004.</w:t>
       </w:r>
     </w:p>
-    <w:bookmarkEnd w:id="28"/>
+    <w:bookmarkEnd w:id="45"/>
     <w:sectPr>
-      <w:footnotePr>
-        <w:numRestart w:val="eachSect"/>
-      </w:footnotePr>
+      <w:headerReference r:id="rId12" w:type="even"/>
+      <w:headerReference r:id="rId13" w:type="default"/>
+      <w:footerReference r:id="rId14" w:type="even"/>
+      <w:footerReference r:id="rId15" w:type="default"/>
+      <w:headerReference r:id="rId16" w:type="first"/>
+      <w:footerReference r:id="rId17" w:type="first"/>
+      <w:type w:val="continuous"/>
+      <w:pgSz w:h="16838" w:w="11906"/>
+      <w:pgMar w:bottom="1134" w:footer="708" w:gutter="0" w:header="708" w:left="1417" w:right="1417" w:top="1417"/>
+      <w:cols w:space="708"/>
+      <w:docGrid w:linePitch="360"/>
     </w:sectPr>
   </w:body>
 </w:document>
@@ -772,6 +834,65 @@
 <w:comments xmlns:w="http://schemas.openxmlformats.org/wordprocessingml/2006/main" xmlns:m="http://schemas.openxmlformats.org/officeDocument/2006/math" xmlns:r="http://schemas.openxmlformats.org/officeDocument/2006/relationships" xmlns:o="urn:schemas-microsoft-com:office:office" xmlns:v="urn:schemas-microsoft-com:vml" xmlns:w10="urn:schemas-microsoft-com:office:word" xmlns:a="http://schemas.openxmlformats.org/drawingml/2006/main" xmlns:pic="http://schemas.openxmlformats.org/drawingml/2006/picture" xmlns:wp="http://schemas.openxmlformats.org/drawingml/2006/wordprocessingDrawing"/>
 </file>
 
+<file path=word/footer1.xml><?xml version="1.0" encoding="utf-8"?>
+<w:ftr xmlns:wpc="http://schemas.microsoft.com/office/word/2010/wordprocessingCanvas" xmlns:cx="http://schemas.microsoft.com/office/drawing/2014/chartex" xmlns:cx1="http://schemas.microsoft.com/office/drawing/2015/9/8/chartex" xmlns:cx2="http://schemas.microsoft.com/office/drawing/2015/10/21/chartex" xmlns:cx3="http://schemas.microsoft.com/office/drawing/2016/5/9/chartex" xmlns:cx4="http://schemas.microsoft.com/office/drawing/2016/5/10/chartex" xmlns:cx5="http://schemas.microsoft.com/office/drawing/2016/5/11/chartex" xmlns:cx6="http://schemas.microsoft.com/office/drawing/2016/5/12/chartex" xmlns:cx7="http://schemas.microsoft.com/office/drawing/2016/5/13/chartex" xmlns:cx8="http://schemas.microsoft.com/office/drawing/2016/5/14/chartex" xmlns:mc="http://schemas.openxmlformats.org/markup-compatibility/2006" xmlns:aink="http://schemas.microsoft.com/office/drawing/2016/ink" xmlns:am3d="http://schemas.microsoft.com/office/drawing/2017/model3d" xmlns:o="urn:schemas-microsoft-com:office:office" xmlns:oel="http://schemas.microsoft.com/office/2019/extlst" xmlns:r="http://schemas.openxmlformats.org/officeDocument/2006/relationships" xmlns:m="http://schemas.openxmlformats.org/officeDocument/2006/math" xmlns:v="urn:schemas-microsoft-com:vml" xmlns:wp14="http://schemas.microsoft.com/office/word/2010/wordprocessingDrawing" xmlns:wp="http://schemas.openxmlformats.org/drawingml/2006/wordprocessingDrawing" xmlns:w10="urn:schemas-microsoft-com:office:word" xmlns:w="http://schemas.openxmlformats.org/wordprocessingml/2006/main" xmlns:w14="http://schemas.microsoft.com/office/word/2010/wordml" xmlns:w15="http://schemas.microsoft.com/office/word/2012/wordml" xmlns:w16cex="http://schemas.microsoft.com/office/word/2018/wordml/cex" xmlns:w16cid="http://schemas.microsoft.com/office/word/2016/wordml/cid" xmlns:w16="http://schemas.microsoft.com/office/word/2018/wordml" xmlns:w16du="http://schemas.microsoft.com/office/word/2023/wordml/word16du" xmlns:w16sdtdh="http://schemas.microsoft.com/office/word/2020/wordml/sdtdatahash" xmlns:w16se="http://schemas.microsoft.com/office/word/2015/wordml/symex" xmlns:wpg="http://schemas.microsoft.com/office/word/2010/wordprocessingGroup" xmlns:wpi="http://schemas.microsoft.com/office/word/2010/wordprocessingInk" xmlns:wne="http://schemas.microsoft.com/office/word/2006/wordml" xmlns:wps="http://schemas.microsoft.com/office/word/2010/wordprocessingShape" mc:Ignorable="w14 w15 w16se w16cid w16 w16cex w16sdtdh w16du wp14">
+  <w:p>
+    <w:pPr>
+      <w:pStyle w:val="a7"/>
+      <w:ind w:firstLine="480"/>
+    </w:pPr>
+  </w:p>
+</w:ftr>
+</file>
+
+<file path=word/footer2.xml><?xml version="1.0" encoding="utf-8"?>
+<w:ftr xmlns:wpc="http://schemas.microsoft.com/office/word/2010/wordprocessingCanvas" xmlns:cx="http://schemas.microsoft.com/office/drawing/2014/chartex" xmlns:cx1="http://schemas.microsoft.com/office/drawing/2015/9/8/chartex" xmlns:cx2="http://schemas.microsoft.com/office/drawing/2015/10/21/chartex" xmlns:cx3="http://schemas.microsoft.com/office/drawing/2016/5/9/chartex" xmlns:cx4="http://schemas.microsoft.com/office/drawing/2016/5/10/chartex" xmlns:cx5="http://schemas.microsoft.com/office/drawing/2016/5/11/chartex" xmlns:cx6="http://schemas.microsoft.com/office/drawing/2016/5/12/chartex" xmlns:cx7="http://schemas.microsoft.com/office/drawing/2016/5/13/chartex" xmlns:cx8="http://schemas.microsoft.com/office/drawing/2016/5/14/chartex" xmlns:mc="http://schemas.openxmlformats.org/markup-compatibility/2006" xmlns:aink="http://schemas.microsoft.com/office/drawing/2016/ink" xmlns:am3d="http://schemas.microsoft.com/office/drawing/2017/model3d" xmlns:o="urn:schemas-microsoft-com:office:office" xmlns:oel="http://schemas.microsoft.com/office/2019/extlst" xmlns:r="http://schemas.openxmlformats.org/officeDocument/2006/relationships" xmlns:m="http://schemas.openxmlformats.org/officeDocument/2006/math" xmlns:v="urn:schemas-microsoft-com:vml" xmlns:wp14="http://schemas.microsoft.com/office/word/2010/wordprocessingDrawing" xmlns:wp="http://schemas.openxmlformats.org/drawingml/2006/wordprocessingDrawing" xmlns:w10="urn:schemas-microsoft-com:office:word" xmlns:w="http://schemas.openxmlformats.org/wordprocessingml/2006/main" xmlns:w14="http://schemas.microsoft.com/office/word/2010/wordml" xmlns:w15="http://schemas.microsoft.com/office/word/2012/wordml" xmlns:w16cex="http://schemas.microsoft.com/office/word/2018/wordml/cex" xmlns:w16cid="http://schemas.microsoft.com/office/word/2016/wordml/cid" xmlns:w16="http://schemas.microsoft.com/office/word/2018/wordml" xmlns:w16du="http://schemas.microsoft.com/office/word/2023/wordml/word16du" xmlns:w16sdtdh="http://schemas.microsoft.com/office/word/2020/wordml/sdtdatahash" xmlns:w16se="http://schemas.microsoft.com/office/word/2015/wordml/symex" xmlns:wpg="http://schemas.microsoft.com/office/word/2010/wordprocessingGroup" xmlns:wpi="http://schemas.microsoft.com/office/word/2010/wordprocessingInk" xmlns:wne="http://schemas.microsoft.com/office/word/2006/wordml" xmlns:wps="http://schemas.microsoft.com/office/word/2010/wordprocessingShape" mc:Ignorable="w14 w15 w16se w16cid w16 w16cex w16sdtdh w16du wp14">
+  <w:p>
+    <w:pPr>
+      <w:pStyle w:val="a7"/>
+      <w:ind w:firstLine="480"/>
+      <w:jc w:val="center"/>
+    </w:pPr>
+    <w:r>
+      <w:fldChar w:fldCharType="begin"/>
+    </w:r>
+    <w:r>
+      <w:instrText>PAGE   \* MERGEFORMAT</w:instrText>
+    </w:r>
+    <w:r>
+      <w:fldChar w:fldCharType="separate"/>
+    </w:r>
+    <w:r>
+      <w:rPr>
+        <w:noProof/>
+      </w:rPr>
+      <w:t>2</w:t>
+    </w:r>
+    <w:r>
+      <w:fldChar w:fldCharType="end"/>
+    </w:r>
+  </w:p>
+  <w:p>
+    <w:pPr>
+      <w:pStyle w:val="a7"/>
+      <w:ind w:firstLine="480"/>
+      <w:jc w:val="center"/>
+    </w:pPr>
+  </w:p>
+</w:ftr>
+</file>
+
+<file path=word/footer3.xml><?xml version="1.0" encoding="utf-8"?>
+<w:ftr xmlns:wpc="http://schemas.microsoft.com/office/word/2010/wordprocessingCanvas" xmlns:cx="http://schemas.microsoft.com/office/drawing/2014/chartex" xmlns:cx1="http://schemas.microsoft.com/office/drawing/2015/9/8/chartex" xmlns:cx2="http://schemas.microsoft.com/office/drawing/2015/10/21/chartex" xmlns:cx3="http://schemas.microsoft.com/office/drawing/2016/5/9/chartex" xmlns:cx4="http://schemas.microsoft.com/office/drawing/2016/5/10/chartex" xmlns:cx5="http://schemas.microsoft.com/office/drawing/2016/5/11/chartex" xmlns:cx6="http://schemas.microsoft.com/office/drawing/2016/5/12/chartex" xmlns:cx7="http://schemas.microsoft.com/office/drawing/2016/5/13/chartex" xmlns:cx8="http://schemas.microsoft.com/office/drawing/2016/5/14/chartex" xmlns:mc="http://schemas.openxmlformats.org/markup-compatibility/2006" xmlns:aink="http://schemas.microsoft.com/office/drawing/2016/ink" xmlns:am3d="http://schemas.microsoft.com/office/drawing/2017/model3d" xmlns:o="urn:schemas-microsoft-com:office:office" xmlns:oel="http://schemas.microsoft.com/office/2019/extlst" xmlns:r="http://schemas.openxmlformats.org/officeDocument/2006/relationships" xmlns:m="http://schemas.openxmlformats.org/officeDocument/2006/math" xmlns:v="urn:schemas-microsoft-com:vml" xmlns:wp14="http://schemas.microsoft.com/office/word/2010/wordprocessingDrawing" xmlns:wp="http://schemas.openxmlformats.org/drawingml/2006/wordprocessingDrawing" xmlns:w10="urn:schemas-microsoft-com:office:word" xmlns:w="http://schemas.openxmlformats.org/wordprocessingml/2006/main" xmlns:w14="http://schemas.microsoft.com/office/word/2010/wordml" xmlns:w15="http://schemas.microsoft.com/office/word/2012/wordml" xmlns:w16cex="http://schemas.microsoft.com/office/word/2018/wordml/cex" xmlns:w16cid="http://schemas.microsoft.com/office/word/2016/wordml/cid" xmlns:w16="http://schemas.microsoft.com/office/word/2018/wordml" xmlns:w16du="http://schemas.microsoft.com/office/word/2023/wordml/word16du" xmlns:w16sdtdh="http://schemas.microsoft.com/office/word/2020/wordml/sdtdatahash" xmlns:w16se="http://schemas.microsoft.com/office/word/2015/wordml/symex" xmlns:wpg="http://schemas.microsoft.com/office/word/2010/wordprocessingGroup" xmlns:wpi="http://schemas.microsoft.com/office/word/2010/wordprocessingInk" xmlns:wne="http://schemas.microsoft.com/office/word/2006/wordml" xmlns:wps="http://schemas.microsoft.com/office/word/2010/wordprocessingShape" mc:Ignorable="w14 w15 w16se w16cid w16 w16cex w16sdtdh w16du wp14">
+  <w:p>
+    <w:pPr>
+      <w:pStyle w:val="a7"/>
+      <w:ind w:firstLine="480"/>
+    </w:pPr>
+  </w:p>
+</w:ftr>
+</file>
+
 <file path=word/footnotes.xml><?xml version="1.0" encoding="utf-8"?>
 <w:footnotes xmlns:w="http://schemas.openxmlformats.org/wordprocessingml/2006/main" xmlns:m="http://schemas.openxmlformats.org/officeDocument/2006/math" xmlns:r="http://schemas.openxmlformats.org/officeDocument/2006/relationships" xmlns:o="urn:schemas-microsoft-com:office:office" xmlns:v="urn:schemas-microsoft-com:vml" xmlns:w10="urn:schemas-microsoft-com:office:word" xmlns:a="http://schemas.openxmlformats.org/drawingml/2006/main" xmlns:pic="http://schemas.openxmlformats.org/drawingml/2006/picture" xmlns:wp="http://schemas.openxmlformats.org/drawingml/2006/wordprocessingDrawing">
   <w:footnote w:type="continuationSeparator" w:id="0">
@@ -791,8 +912,236 @@
 </w:footnotes>
 </file>
 
+<file path=word/header1.xml><?xml version="1.0" encoding="utf-8"?>
+<w:hdr xmlns:wpc="http://schemas.microsoft.com/office/word/2010/wordprocessingCanvas" xmlns:cx="http://schemas.microsoft.com/office/drawing/2014/chartex" xmlns:cx1="http://schemas.microsoft.com/office/drawing/2015/9/8/chartex" xmlns:cx2="http://schemas.microsoft.com/office/drawing/2015/10/21/chartex" xmlns:cx3="http://schemas.microsoft.com/office/drawing/2016/5/9/chartex" xmlns:cx4="http://schemas.microsoft.com/office/drawing/2016/5/10/chartex" xmlns:cx5="http://schemas.microsoft.com/office/drawing/2016/5/11/chartex" xmlns:cx6="http://schemas.microsoft.com/office/drawing/2016/5/12/chartex" xmlns:cx7="http://schemas.microsoft.com/office/drawing/2016/5/13/chartex" xmlns:cx8="http://schemas.microsoft.com/office/drawing/2016/5/14/chartex" xmlns:mc="http://schemas.openxmlformats.org/markup-compatibility/2006" xmlns:aink="http://schemas.microsoft.com/office/drawing/2016/ink" xmlns:am3d="http://schemas.microsoft.com/office/drawing/2017/model3d" xmlns:o="urn:schemas-microsoft-com:office:office" xmlns:oel="http://schemas.microsoft.com/office/2019/extlst" xmlns:r="http://schemas.openxmlformats.org/officeDocument/2006/relationships" xmlns:m="http://schemas.openxmlformats.org/officeDocument/2006/math" xmlns:v="urn:schemas-microsoft-com:vml" xmlns:wp14="http://schemas.microsoft.com/office/word/2010/wordprocessingDrawing" xmlns:wp="http://schemas.openxmlformats.org/drawingml/2006/wordprocessingDrawing" xmlns:w10="urn:schemas-microsoft-com:office:word" xmlns:w="http://schemas.openxmlformats.org/wordprocessingml/2006/main" xmlns:w14="http://schemas.microsoft.com/office/word/2010/wordml" xmlns:w15="http://schemas.microsoft.com/office/word/2012/wordml" xmlns:w16cex="http://schemas.microsoft.com/office/word/2018/wordml/cex" xmlns:w16cid="http://schemas.microsoft.com/office/word/2016/wordml/cid" xmlns:w16="http://schemas.microsoft.com/office/word/2018/wordml" xmlns:w16du="http://schemas.microsoft.com/office/word/2023/wordml/word16du" xmlns:w16sdtdh="http://schemas.microsoft.com/office/word/2020/wordml/sdtdatahash" xmlns:w16se="http://schemas.microsoft.com/office/word/2015/wordml/symex" xmlns:wpg="http://schemas.microsoft.com/office/word/2010/wordprocessingGroup" xmlns:wpi="http://schemas.microsoft.com/office/word/2010/wordprocessingInk" xmlns:wne="http://schemas.microsoft.com/office/word/2006/wordml" xmlns:wps="http://schemas.microsoft.com/office/word/2010/wordprocessingShape" mc:Ignorable="w14 w15 w16se w16cid w16 w16cex w16sdtdh w16du wp14">
+  <w:p>
+    <w:pPr>
+      <w:pStyle w:val="a5"/>
+      <w:ind w:firstLine="480"/>
+    </w:pPr>
+  </w:p>
+</w:hdr>
+</file>
+
+<file path=word/header2.xml><?xml version="1.0" encoding="utf-8"?>
+<w:hdr xmlns:wpc="http://schemas.microsoft.com/office/word/2010/wordprocessingCanvas" xmlns:cx="http://schemas.microsoft.com/office/drawing/2014/chartex" xmlns:cx1="http://schemas.microsoft.com/office/drawing/2015/9/8/chartex" xmlns:cx2="http://schemas.microsoft.com/office/drawing/2015/10/21/chartex" xmlns:cx3="http://schemas.microsoft.com/office/drawing/2016/5/9/chartex" xmlns:cx4="http://schemas.microsoft.com/office/drawing/2016/5/10/chartex" xmlns:cx5="http://schemas.microsoft.com/office/drawing/2016/5/11/chartex" xmlns:cx6="http://schemas.microsoft.com/office/drawing/2016/5/12/chartex" xmlns:cx7="http://schemas.microsoft.com/office/drawing/2016/5/13/chartex" xmlns:cx8="http://schemas.microsoft.com/office/drawing/2016/5/14/chartex" xmlns:mc="http://schemas.openxmlformats.org/markup-compatibility/2006" xmlns:aink="http://schemas.microsoft.com/office/drawing/2016/ink" xmlns:am3d="http://schemas.microsoft.com/office/drawing/2017/model3d" xmlns:o="urn:schemas-microsoft-com:office:office" xmlns:oel="http://schemas.microsoft.com/office/2019/extlst" xmlns:r="http://schemas.openxmlformats.org/officeDocument/2006/relationships" xmlns:m="http://schemas.openxmlformats.org/officeDocument/2006/math" xmlns:v="urn:schemas-microsoft-com:vml" xmlns:wp14="http://schemas.microsoft.com/office/word/2010/wordprocessingDrawing" xmlns:wp="http://schemas.openxmlformats.org/drawingml/2006/wordprocessingDrawing" xmlns:w10="urn:schemas-microsoft-com:office:word" xmlns:w="http://schemas.openxmlformats.org/wordprocessingml/2006/main" xmlns:w14="http://schemas.microsoft.com/office/word/2010/wordml" xmlns:w15="http://schemas.microsoft.com/office/word/2012/wordml" xmlns:w16cex="http://schemas.microsoft.com/office/word/2018/wordml/cex" xmlns:w16cid="http://schemas.microsoft.com/office/word/2016/wordml/cid" xmlns:w16="http://schemas.microsoft.com/office/word/2018/wordml" xmlns:w16du="http://schemas.microsoft.com/office/word/2023/wordml/word16du" xmlns:w16sdtdh="http://schemas.microsoft.com/office/word/2020/wordml/sdtdatahash" xmlns:w16se="http://schemas.microsoft.com/office/word/2015/wordml/symex" xmlns:wpg="http://schemas.microsoft.com/office/word/2010/wordprocessingGroup" xmlns:wpi="http://schemas.microsoft.com/office/word/2010/wordprocessingInk" xmlns:wne="http://schemas.microsoft.com/office/word/2006/wordml" xmlns:wps="http://schemas.microsoft.com/office/word/2010/wordprocessingShape" mc:Ignorable="w14 w15 w16se w16cid w16 w16cex w16sdtdh w16du wp14">
+  <w:p>
+    <w:pPr>
+      <w:pStyle w:val="a5"/>
+      <w:tabs>
+        <w:tab w:val="left" w:pos="5003"/>
+      </w:tabs>
+      <w:ind w:firstLine="480"/>
+      <w:jc w:val="right"/>
+      <w:rPr>
+        <w:lang w:val="en-US"/>
+      </w:rPr>
+    </w:pPr>
+    <w:r>
+      <w:tab/>
+    </w:r>
+  </w:p>
+</w:hdr>
+</file>
+
+<file path=word/header3.xml><?xml version="1.0" encoding="utf-8"?>
+<w:hdr xmlns:wpc="http://schemas.microsoft.com/office/word/2010/wordprocessingCanvas" xmlns:cx="http://schemas.microsoft.com/office/drawing/2014/chartex" xmlns:cx1="http://schemas.microsoft.com/office/drawing/2015/9/8/chartex" xmlns:cx2="http://schemas.microsoft.com/office/drawing/2015/10/21/chartex" xmlns:cx3="http://schemas.microsoft.com/office/drawing/2016/5/9/chartex" xmlns:cx4="http://schemas.microsoft.com/office/drawing/2016/5/10/chartex" xmlns:cx5="http://schemas.microsoft.com/office/drawing/2016/5/11/chartex" xmlns:cx6="http://schemas.microsoft.com/office/drawing/2016/5/12/chartex" xmlns:cx7="http://schemas.microsoft.com/office/drawing/2016/5/13/chartex" xmlns:cx8="http://schemas.microsoft.com/office/drawing/2016/5/14/chartex" xmlns:mc="http://schemas.openxmlformats.org/markup-compatibility/2006" xmlns:aink="http://schemas.microsoft.com/office/drawing/2016/ink" xmlns:am3d="http://schemas.microsoft.com/office/drawing/2017/model3d" xmlns:o="urn:schemas-microsoft-com:office:office" xmlns:oel="http://schemas.microsoft.com/office/2019/extlst" xmlns:r="http://schemas.openxmlformats.org/officeDocument/2006/relationships" xmlns:m="http://schemas.openxmlformats.org/officeDocument/2006/math" xmlns:v="urn:schemas-microsoft-com:vml" xmlns:wp14="http://schemas.microsoft.com/office/word/2010/wordprocessingDrawing" xmlns:wp="http://schemas.openxmlformats.org/drawingml/2006/wordprocessingDrawing" xmlns:w10="urn:schemas-microsoft-com:office:word" xmlns:w="http://schemas.openxmlformats.org/wordprocessingml/2006/main" xmlns:w14="http://schemas.microsoft.com/office/word/2010/wordml" xmlns:w15="http://schemas.microsoft.com/office/word/2012/wordml" xmlns:w16cex="http://schemas.microsoft.com/office/word/2018/wordml/cex" xmlns:w16cid="http://schemas.microsoft.com/office/word/2016/wordml/cid" xmlns:w16="http://schemas.microsoft.com/office/word/2018/wordml" xmlns:w16du="http://schemas.microsoft.com/office/word/2023/wordml/word16du" xmlns:w16sdtdh="http://schemas.microsoft.com/office/word/2020/wordml/sdtdatahash" xmlns:w16se="http://schemas.microsoft.com/office/word/2015/wordml/symex" xmlns:wpg="http://schemas.microsoft.com/office/word/2010/wordprocessingGroup" xmlns:wpi="http://schemas.microsoft.com/office/word/2010/wordprocessingInk" xmlns:wne="http://schemas.microsoft.com/office/word/2006/wordml" xmlns:wps="http://schemas.microsoft.com/office/word/2010/wordprocessingShape" mc:Ignorable="w14 w15 w16se w16cid w16 w16cex w16sdtdh w16du wp14">
+  <w:p>
+    <w:pPr>
+      <w:pStyle w:val="a5"/>
+      <w:ind w:firstLine="480"/>
+    </w:pPr>
+  </w:p>
+</w:hdr>
+</file>
+
 <file path=word/numbering.xml><?xml version="1.0" encoding="utf-8"?>
-<w:numbering xmlns:w="http://schemas.openxmlformats.org/wordprocessingml/2006/main">
+<w:numbering xmlns:aink="http://schemas.microsoft.com/office/drawing/2016/ink" xmlns:am3d="http://schemas.microsoft.com/office/drawing/2017/model3d" xmlns:cx="http://schemas.microsoft.com/office/drawing/2014/chartex" xmlns:cx1="http://schemas.microsoft.com/office/drawing/2015/9/8/chartex" xmlns:cx2="http://schemas.microsoft.com/office/drawing/2015/10/21/chartex" xmlns:cx3="http://schemas.microsoft.com/office/drawing/2016/5/9/chartex" xmlns:cx4="http://schemas.microsoft.com/office/drawing/2016/5/10/chartex" xmlns:cx5="http://schemas.microsoft.com/office/drawing/2016/5/11/chartex" xmlns:cx6="http://schemas.microsoft.com/office/drawing/2016/5/12/chartex" xmlns:cx7="http://schemas.microsoft.com/office/drawing/2016/5/13/chartex" xmlns:cx8="http://schemas.microsoft.com/office/drawing/2016/5/14/chartex" xmlns:m="http://schemas.openxmlformats.org/officeDocument/2006/math" xmlns:mc="http://schemas.openxmlformats.org/markup-compatibility/2006" xmlns:o="urn:schemas-microsoft-com:office:office" xmlns:oel="http://schemas.microsoft.com/office/2019/extlst" xmlns:r="http://schemas.openxmlformats.org/officeDocument/2006/relationships" xmlns:v="urn:schemas-microsoft-com:vml" xmlns:w="http://schemas.openxmlformats.org/wordprocessingml/2006/main" xmlns:w10="urn:schemas-microsoft-com:office:word" xmlns:w14="http://schemas.microsoft.com/office/word/2010/wordml" xmlns:w15="http://schemas.microsoft.com/office/word/2012/wordml" xmlns:w16="http://schemas.microsoft.com/office/word/2018/wordml" xmlns:w16cex="http://schemas.microsoft.com/office/word/2018/wordml/cex" xmlns:w16cid="http://schemas.microsoft.com/office/word/2016/wordml/cid" xmlns:w16du="http://schemas.microsoft.com/office/word/2023/wordml/word16du" xmlns:w16sdtdh="http://schemas.microsoft.com/office/word/2020/wordml/sdtdatahash" xmlns:w16se="http://schemas.microsoft.com/office/word/2015/wordml/symex" xmlns:wne="http://schemas.microsoft.com/office/word/2006/wordml" xmlns:wp="http://schemas.openxmlformats.org/drawingml/2006/wordprocessingDrawing" xmlns:wp14="http://schemas.microsoft.com/office/word/2010/wordprocessingDrawing" xmlns:wpc="http://schemas.microsoft.com/office/word/2010/wordprocessingCanvas" xmlns:wpg="http://schemas.microsoft.com/office/word/2010/wordprocessingGroup" xmlns:wpi="http://schemas.microsoft.com/office/word/2010/wordprocessingInk" xmlns:wps="http://schemas.microsoft.com/office/word/2010/wordprocessingShape" mc:Ignorable="w14 w15 w16se w16cid w16 w16cex w16sdtdh w16du wp14">
+  <w:abstractNum w15:restartNumberingAfterBreak="0" w:abstractNumId="0">
+    <w:nsid w:val="FFFFFF7C"/>
+    <w:multiLevelType w:val="singleLevel"/>
+    <w:tmpl w:val="B3A8C3C6"/>
+    <w:lvl w:ilvl="0">
+      <w:start w:val="1"/>
+      <w:numFmt w:val="decimal"/>
+      <w:lvlText w:val="%1."/>
+      <w:lvlJc w:val="left"/>
+      <w:pPr>
+        <w:tabs>
+          <w:tab w:pos="2040" w:val="num"/>
+        </w:tabs>
+        <w:ind w:hanging="360" w:hangingChars="200" w:left="2040" w:leftChars="800"/>
+      </w:pPr>
+    </w:lvl>
+  </w:abstractNum>
+  <w:abstractNum w15:restartNumberingAfterBreak="0" w:abstractNumId="1">
+    <w:nsid w:val="FFFFFF7D"/>
+    <w:multiLevelType w:val="singleLevel"/>
+    <w:tmpl w:val="A1D4ECB6"/>
+    <w:lvl w:ilvl="0">
+      <w:start w:val="1"/>
+      <w:numFmt w:val="decimal"/>
+      <w:lvlText w:val="%1."/>
+      <w:lvlJc w:val="left"/>
+      <w:pPr>
+        <w:tabs>
+          <w:tab w:pos="1620" w:val="num"/>
+        </w:tabs>
+        <w:ind w:hanging="360" w:hangingChars="200" w:left="1620" w:leftChars="600"/>
+      </w:pPr>
+    </w:lvl>
+  </w:abstractNum>
+  <w:abstractNum w15:restartNumberingAfterBreak="0" w:abstractNumId="2">
+    <w:nsid w:val="FFFFFF7E"/>
+    <w:multiLevelType w:val="singleLevel"/>
+    <w:tmpl w:val="211EBD2E"/>
+    <w:lvl w:ilvl="0">
+      <w:start w:val="1"/>
+      <w:numFmt w:val="decimal"/>
+      <w:lvlText w:val="%1."/>
+      <w:lvlJc w:val="left"/>
+      <w:pPr>
+        <w:tabs>
+          <w:tab w:pos="1200" w:val="num"/>
+        </w:tabs>
+        <w:ind w:hanging="360" w:hangingChars="200" w:left="1200" w:leftChars="400"/>
+      </w:pPr>
+    </w:lvl>
+  </w:abstractNum>
+  <w:abstractNum w15:restartNumberingAfterBreak="0" w:abstractNumId="3">
+    <w:nsid w:val="FFFFFF7F"/>
+    <w:multiLevelType w:val="singleLevel"/>
+    <w:tmpl w:val="2E4684B8"/>
+    <w:lvl w:ilvl="0">
+      <w:start w:val="1"/>
+      <w:numFmt w:val="decimal"/>
+      <w:lvlText w:val="%1."/>
+      <w:lvlJc w:val="left"/>
+      <w:pPr>
+        <w:tabs>
+          <w:tab w:pos="780" w:val="num"/>
+        </w:tabs>
+        <w:ind w:hanging="360" w:hangingChars="200" w:left="780" w:leftChars="200"/>
+      </w:pPr>
+    </w:lvl>
+  </w:abstractNum>
+  <w:abstractNum w15:restartNumberingAfterBreak="0" w:abstractNumId="4">
+    <w:nsid w:val="FFFFFF80"/>
+    <w:multiLevelType w:val="singleLevel"/>
+    <w:tmpl w:val="0E8EBE28"/>
+    <w:lvl w:ilvl="0">
+      <w:start w:val="1"/>
+      <w:numFmt w:val="bullet"/>
+      <w:lvlText w:val=""/>
+      <w:lvlJc w:val="left"/>
+      <w:pPr>
+        <w:tabs>
+          <w:tab w:pos="2040" w:val="num"/>
+        </w:tabs>
+        <w:ind w:hanging="360" w:hangingChars="200" w:left="2040" w:leftChars="800"/>
+      </w:pPr>
+      <w:rPr>
+        <w:rFonts w:ascii="Wingdings" w:hAnsi="Wingdings" w:hint="default"/>
+      </w:rPr>
+    </w:lvl>
+  </w:abstractNum>
+  <w:abstractNum w15:restartNumberingAfterBreak="0" w:abstractNumId="5">
+    <w:nsid w:val="FFFFFF81"/>
+    <w:multiLevelType w:val="singleLevel"/>
+    <w:tmpl w:val="754C5FA0"/>
+    <w:lvl w:ilvl="0">
+      <w:start w:val="1"/>
+      <w:numFmt w:val="bullet"/>
+      <w:lvlText w:val=""/>
+      <w:lvlJc w:val="left"/>
+      <w:pPr>
+        <w:tabs>
+          <w:tab w:pos="1620" w:val="num"/>
+        </w:tabs>
+        <w:ind w:hanging="360" w:hangingChars="200" w:left="1620" w:leftChars="600"/>
+      </w:pPr>
+      <w:rPr>
+        <w:rFonts w:ascii="Wingdings" w:hAnsi="Wingdings" w:hint="default"/>
+      </w:rPr>
+    </w:lvl>
+  </w:abstractNum>
+  <w:abstractNum w15:restartNumberingAfterBreak="0" w:abstractNumId="6">
+    <w:nsid w:val="FFFFFF82"/>
+    <w:multiLevelType w:val="singleLevel"/>
+    <w:tmpl w:val="68FABD2A"/>
+    <w:lvl w:ilvl="0">
+      <w:start w:val="1"/>
+      <w:numFmt w:val="bullet"/>
+      <w:lvlText w:val=""/>
+      <w:lvlJc w:val="left"/>
+      <w:pPr>
+        <w:tabs>
+          <w:tab w:pos="1200" w:val="num"/>
+        </w:tabs>
+        <w:ind w:hanging="360" w:hangingChars="200" w:left="1200" w:leftChars="400"/>
+      </w:pPr>
+      <w:rPr>
+        <w:rFonts w:ascii="Wingdings" w:hAnsi="Wingdings" w:hint="default"/>
+      </w:rPr>
+    </w:lvl>
+  </w:abstractNum>
+  <w:abstractNum w15:restartNumberingAfterBreak="0" w:abstractNumId="7">
+    <w:nsid w:val="FFFFFF83"/>
+    <w:multiLevelType w:val="singleLevel"/>
+    <w:tmpl w:val="95AEE2B2"/>
+    <w:lvl w:ilvl="0">
+      <w:start w:val="1"/>
+      <w:numFmt w:val="bullet"/>
+      <w:lvlText w:val=""/>
+      <w:lvlJc w:val="left"/>
+      <w:pPr>
+        <w:tabs>
+          <w:tab w:pos="780" w:val="num"/>
+        </w:tabs>
+        <w:ind w:hanging="360" w:hangingChars="200" w:left="780" w:leftChars="200"/>
+      </w:pPr>
+      <w:rPr>
+        <w:rFonts w:ascii="Wingdings" w:hAnsi="Wingdings" w:hint="default"/>
+      </w:rPr>
+    </w:lvl>
+  </w:abstractNum>
+  <w:abstractNum w15:restartNumberingAfterBreak="0" w:abstractNumId="8">
+    <w:nsid w:val="FFFFFF88"/>
+    <w:multiLevelType w:val="singleLevel"/>
+    <w:tmpl w:val="FBA6C650"/>
+    <w:lvl w:ilvl="0">
+      <w:start w:val="1"/>
+      <w:numFmt w:val="decimal"/>
+      <w:lvlText w:val="%1."/>
+      <w:lvlJc w:val="left"/>
+      <w:pPr>
+        <w:tabs>
+          <w:tab w:pos="360" w:val="num"/>
+        </w:tabs>
+        <w:ind w:hanging="360" w:hangingChars="200" w:left="360"/>
+      </w:pPr>
+    </w:lvl>
+  </w:abstractNum>
+  <w:abstractNum w15:restartNumberingAfterBreak="0" w:abstractNumId="9">
+    <w:nsid w:val="FFFFFF89"/>
+    <w:multiLevelType w:val="singleLevel"/>
+    <w:tmpl w:val="4DECC0E8"/>
+    <w:lvl w:ilvl="0">
+      <w:start w:val="1"/>
+      <w:numFmt w:val="bullet"/>
+      <w:lvlText w:val=""/>
+      <w:lvlJc w:val="left"/>
+      <w:pPr>
+        <w:tabs>
+          <w:tab w:pos="360" w:val="num"/>
+        </w:tabs>
+        <w:ind w:hanging="360" w:hangingChars="200" w:left="360"/>
+      </w:pPr>
+      <w:rPr>
+        <w:rFonts w:ascii="Wingdings" w:hAnsi="Wingdings" w:hint="default"/>
+      </w:rPr>
+    </w:lvl>
+  </w:abstractNum>
   <w:abstractNum w:abstractNumId="990">
     <w:nsid w:val="0000A990"/>
     <w:multiLevelType w:val="multilevel"/>
@@ -972,6 +1321,81 @@
       </w:rPr>
     </w:lvl>
   </w:abstractNum>
+  <w:num w16cid:durableId="2048480083" w:numId="1">
+    <w:abstractNumId w:val="9"/>
+  </w:num>
+  <w:num w16cid:durableId="102963102" w:numId="2">
+    <w:abstractNumId w:val="8"/>
+  </w:num>
+  <w:num w16cid:durableId="1594246375" w:numId="3">
+    <w:abstractNumId w:val="7"/>
+  </w:num>
+  <w:num w16cid:durableId="1008751272" w:numId="4">
+    <w:abstractNumId w:val="6"/>
+  </w:num>
+  <w:num w16cid:durableId="216167873" w:numId="5">
+    <w:abstractNumId w:val="5"/>
+  </w:num>
+  <w:num w16cid:durableId="793643141" w:numId="6">
+    <w:abstractNumId w:val="4"/>
+  </w:num>
+  <w:num w16cid:durableId="656497674" w:numId="7">
+    <w:abstractNumId w:val="3"/>
+  </w:num>
+  <w:num w16cid:durableId="1157964845" w:numId="8">
+    <w:abstractNumId w:val="2"/>
+  </w:num>
+  <w:num w16cid:durableId="959335615" w:numId="9">
+    <w:abstractNumId w:val="1"/>
+  </w:num>
+  <w:num w16cid:durableId="1171675066" w:numId="10">
+    <w:abstractNumId w:val="0"/>
+  </w:num>
+  <w:num w16cid:durableId="662777431" w:numId="11">
+    <w:abstractNumId w:val="8"/>
+  </w:num>
+  <w:num w16cid:durableId="1014113103" w:numId="12">
+    <w:abstractNumId w:val="3"/>
+  </w:num>
+  <w:num w16cid:durableId="405078725" w:numId="13">
+    <w:abstractNumId w:val="2"/>
+  </w:num>
+  <w:num w16cid:durableId="1647004023" w:numId="14">
+    <w:abstractNumId w:val="1"/>
+  </w:num>
+  <w:num w16cid:durableId="2145075599" w:numId="15">
+    <w:abstractNumId w:val="0"/>
+  </w:num>
+  <w:num w16cid:durableId="1038239529" w:numId="16">
+    <w:abstractNumId w:val="8"/>
+  </w:num>
+  <w:num w16cid:durableId="1940482389" w:numId="17">
+    <w:abstractNumId w:val="3"/>
+  </w:num>
+  <w:num w16cid:durableId="1679575145" w:numId="18">
+    <w:abstractNumId w:val="2"/>
+  </w:num>
+  <w:num w16cid:durableId="1716924874" w:numId="19">
+    <w:abstractNumId w:val="1"/>
+  </w:num>
+  <w:num w16cid:durableId="325519017" w:numId="20">
+    <w:abstractNumId w:val="0"/>
+  </w:num>
+  <w:num w16cid:durableId="978923976" w:numId="21">
+    <w:abstractNumId w:val="8"/>
+  </w:num>
+  <w:num w16cid:durableId="679545099" w:numId="22">
+    <w:abstractNumId w:val="3"/>
+  </w:num>
+  <w:num w16cid:durableId="1536037949" w:numId="23">
+    <w:abstractNumId w:val="2"/>
+  </w:num>
+  <w:num w16cid:durableId="1456371518" w:numId="24">
+    <w:abstractNumId w:val="1"/>
+  </w:num>
+  <w:num w16cid:durableId="1225524526" w:numId="25">
+    <w:abstractNumId w:val="0"/>
+  </w:num>
   <w:num w:numId="1000">
     <w:abstractNumId w:val="990"/>
   </w:num>
@@ -982,544 +1406,481 @@
 </file>
 
 <file path=word/styles.xml><?xml version="1.0" encoding="utf-8"?>
-<w:styles xmlns:r="http://schemas.openxmlformats.org/officeDocument/2006/relationships" xmlns:w="http://schemas.openxmlformats.org/wordprocessingml/2006/main">
+<w:styles xmlns:mc="http://schemas.openxmlformats.org/markup-compatibility/2006" xmlns:r="http://schemas.openxmlformats.org/officeDocument/2006/relationships" xmlns:w="http://schemas.openxmlformats.org/wordprocessingml/2006/main" xmlns:w14="http://schemas.microsoft.com/office/word/2010/wordml" xmlns:w15="http://schemas.microsoft.com/office/word/2012/wordml" xmlns:w16="http://schemas.microsoft.com/office/word/2018/wordml" xmlns:w16cex="http://schemas.microsoft.com/office/word/2018/wordml/cex" xmlns:w16cid="http://schemas.microsoft.com/office/word/2016/wordml/cid" xmlns:w16du="http://schemas.microsoft.com/office/word/2023/wordml/word16du" xmlns:w16sdtdh="http://schemas.microsoft.com/office/word/2020/wordml/sdtdatahash" xmlns:w16se="http://schemas.microsoft.com/office/word/2015/wordml/symex" mc:Ignorable="w14 w15 w16se w16cid w16 w16cex w16sdtdh w16du">
   <w:docDefaults>
     <w:rPrDefault>
       <w:rPr>
-        <w:rFonts w:asciiTheme="minorHAnsi" w:cstheme="minorBidi" w:eastAsiaTheme="minorEastAsia" w:hAnsiTheme="minorHAnsi"/>
-        <w:sz w:val="24"/>
-        <w:szCs w:val="24"/>
-        <w:lang w:bidi="ar-SA" w:eastAsia="zh-CN" w:val="en-US"/>
+        <w:rFonts w:ascii="Times New Roman" w:cs="Times New Roman" w:eastAsia="MS Mincho" w:hAnsi="Times New Roman"/>
+        <w:lang w:bidi="ar-SA" w:eastAsia="en-GB" w:val="en-GB"/>
       </w:rPr>
     </w:rPrDefault>
-    <w:pPrDefault>
-      <w:pPr>
-        <w:spacing w:after="200"/>
-      </w:pPr>
-    </w:pPrDefault>
+    <w:pPrDefault/>
   </w:docDefaults>
-  <w:latentStyles w:count="276" w:defLockedState="0" w:defQFormat="0" w:defSemiHidden="0" w:defUIPriority="0" w:defUnhideWhenUsed="0"/>
-  <w:style w:default="1" w:styleId="Normal" w:type="paragraph">
+  <w:latentStyles w:count="376" w:defLockedState="0" w:defQFormat="0" w:defSemiHidden="0" w:defUIPriority="99" w:defUnhideWhenUsed="0">
+    <w:lsdException w:name="Normal" w:qFormat="1" w:uiPriority="0"/>
+    <w:lsdException w:name="heading 1" w:qFormat="1" w:uiPriority="9"/>
+    <w:lsdException w:name="heading 2" w:qFormat="1" w:semiHidden="1" w:uiPriority="9" w:unhideWhenUsed="1"/>
+    <w:lsdException w:name="heading 3" w:qFormat="1" w:semiHidden="1" w:uiPriority="9" w:unhideWhenUsed="1"/>
+    <w:lsdException w:name="heading 4" w:qFormat="1" w:semiHidden="1" w:uiPriority="9" w:unhideWhenUsed="1"/>
+    <w:lsdException w:name="heading 5" w:qFormat="1" w:semiHidden="1" w:uiPriority="9" w:unhideWhenUsed="1"/>
+    <w:lsdException w:name="heading 6" w:qFormat="1" w:semiHidden="1" w:uiPriority="9" w:unhideWhenUsed="1"/>
+    <w:lsdException w:name="heading 7" w:qFormat="1" w:semiHidden="1" w:uiPriority="9" w:unhideWhenUsed="1"/>
+    <w:lsdException w:name="heading 8" w:qFormat="1" w:semiHidden="1" w:uiPriority="9" w:unhideWhenUsed="1"/>
+    <w:lsdException w:name="heading 9" w:qFormat="1" w:semiHidden="1" w:uiPriority="9" w:unhideWhenUsed="1"/>
+    <w:lsdException w:name="index 1" w:semiHidden="1" w:unhideWhenUsed="1"/>
+    <w:lsdException w:name="index 2" w:semiHidden="1" w:unhideWhenUsed="1"/>
+    <w:lsdException w:name="index 3" w:semiHidden="1" w:unhideWhenUsed="1"/>
+    <w:lsdException w:name="index 4" w:semiHidden="1" w:unhideWhenUsed="1"/>
+    <w:lsdException w:name="index 5" w:semiHidden="1" w:unhideWhenUsed="1"/>
+    <w:lsdException w:name="index 6" w:semiHidden="1" w:unhideWhenUsed="1"/>
+    <w:lsdException w:name="index 7" w:semiHidden="1" w:unhideWhenUsed="1"/>
+    <w:lsdException w:name="index 8" w:semiHidden="1" w:unhideWhenUsed="1"/>
+    <w:lsdException w:name="index 9" w:semiHidden="1" w:unhideWhenUsed="1"/>
+    <w:lsdException w:name="toc 1" w:semiHidden="1" w:uiPriority="39" w:unhideWhenUsed="1"/>
+    <w:lsdException w:name="toc 2" w:semiHidden="1" w:uiPriority="39" w:unhideWhenUsed="1"/>
+    <w:lsdException w:name="toc 3" w:semiHidden="1" w:uiPriority="39" w:unhideWhenUsed="1"/>
+    <w:lsdException w:name="toc 4" w:semiHidden="1" w:uiPriority="39" w:unhideWhenUsed="1"/>
+    <w:lsdException w:name="toc 5" w:semiHidden="1" w:uiPriority="39" w:unhideWhenUsed="1"/>
+    <w:lsdException w:name="toc 6" w:semiHidden="1" w:uiPriority="39" w:unhideWhenUsed="1"/>
+    <w:lsdException w:name="toc 7" w:semiHidden="1" w:uiPriority="39" w:unhideWhenUsed="1"/>
+    <w:lsdException w:name="toc 8" w:semiHidden="1" w:uiPriority="39" w:unhideWhenUsed="1"/>
+    <w:lsdException w:name="toc 9" w:semiHidden="1" w:uiPriority="39" w:unhideWhenUsed="1"/>
+    <w:lsdException w:name="Normal Indent" w:semiHidden="1" w:unhideWhenUsed="1"/>
+    <w:lsdException w:name="footnote text" w:semiHidden="1" w:unhideWhenUsed="1"/>
+    <w:lsdException w:name="annotation text" w:semiHidden="1" w:unhideWhenUsed="1"/>
+    <w:lsdException w:name="header" w:semiHidden="1" w:uiPriority="0" w:unhideWhenUsed="1"/>
+    <w:lsdException w:name="footer" w:semiHidden="1" w:unhideWhenUsed="1"/>
+    <w:lsdException w:name="index heading" w:semiHidden="1" w:unhideWhenUsed="1"/>
+    <w:lsdException w:name="caption" w:qFormat="1" w:semiHidden="1" w:uiPriority="35" w:unhideWhenUsed="1"/>
+    <w:lsdException w:name="table of figures" w:semiHidden="1" w:unhideWhenUsed="1"/>
+    <w:lsdException w:name="envelope address" w:semiHidden="1" w:unhideWhenUsed="1"/>
+    <w:lsdException w:name="envelope return" w:semiHidden="1" w:unhideWhenUsed="1"/>
+    <w:lsdException w:name="footnote reference" w:semiHidden="1" w:unhideWhenUsed="1"/>
+    <w:lsdException w:name="annotation reference" w:semiHidden="1" w:unhideWhenUsed="1"/>
+    <w:lsdException w:name="line number" w:semiHidden="1" w:unhideWhenUsed="1"/>
+    <w:lsdException w:name="page number" w:semiHidden="1" w:unhideWhenUsed="1"/>
+    <w:lsdException w:name="endnote reference" w:semiHidden="1" w:unhideWhenUsed="1"/>
+    <w:lsdException w:name="endnote text" w:semiHidden="1" w:unhideWhenUsed="1"/>
+    <w:lsdException w:name="table of authorities" w:semiHidden="1" w:unhideWhenUsed="1"/>
+    <w:lsdException w:name="macro" w:semiHidden="1" w:unhideWhenUsed="1"/>
+    <w:lsdException w:name="toa heading" w:semiHidden="1" w:unhideWhenUsed="1"/>
+    <w:lsdException w:name="List" w:semiHidden="1" w:unhideWhenUsed="1"/>
+    <w:lsdException w:name="List Bullet" w:semiHidden="1" w:unhideWhenUsed="1"/>
+    <w:lsdException w:name="List Number" w:semiHidden="1" w:unhideWhenUsed="1"/>
+    <w:lsdException w:name="List 2" w:semiHidden="1" w:unhideWhenUsed="1"/>
+    <w:lsdException w:name="List 3" w:semiHidden="1" w:unhideWhenUsed="1"/>
+    <w:lsdException w:name="List 4" w:semiHidden="1" w:unhideWhenUsed="1"/>
+    <w:lsdException w:name="List 5" w:semiHidden="1" w:unhideWhenUsed="1"/>
+    <w:lsdException w:name="List Bullet 2" w:semiHidden="1" w:unhideWhenUsed="1"/>
+    <w:lsdException w:name="List Bullet 3" w:semiHidden="1" w:unhideWhenUsed="1"/>
+    <w:lsdException w:name="List Bullet 4" w:semiHidden="1" w:unhideWhenUsed="1"/>
+    <w:lsdException w:name="List Bullet 5" w:semiHidden="1" w:unhideWhenUsed="1"/>
+    <w:lsdException w:name="List Number 2" w:semiHidden="1" w:unhideWhenUsed="1"/>
+    <w:lsdException w:name="List Number 3" w:semiHidden="1" w:unhideWhenUsed="1"/>
+    <w:lsdException w:name="List Number 4" w:semiHidden="1" w:unhideWhenUsed="1"/>
+    <w:lsdException w:name="List Number 5" w:semiHidden="1" w:unhideWhenUsed="1"/>
+    <w:lsdException w:name="Title" w:qFormat="1" w:uiPriority="10"/>
+    <w:lsdException w:name="Closing" w:semiHidden="1" w:unhideWhenUsed="1"/>
+    <w:lsdException w:name="Signature" w:semiHidden="1" w:unhideWhenUsed="1"/>
+    <w:lsdException w:name="Default Paragraph Font" w:semiHidden="1" w:uiPriority="1" w:unhideWhenUsed="1"/>
+    <w:lsdException w:name="Body Text" w:semiHidden="1" w:unhideWhenUsed="1"/>
+    <w:lsdException w:name="Body Text Indent" w:semiHidden="1" w:unhideWhenUsed="1"/>
+    <w:lsdException w:name="List Continue" w:semiHidden="1" w:unhideWhenUsed="1"/>
+    <w:lsdException w:name="List Continue 2" w:semiHidden="1" w:unhideWhenUsed="1"/>
+    <w:lsdException w:name="List Continue 3" w:semiHidden="1" w:unhideWhenUsed="1"/>
+    <w:lsdException w:name="List Continue 4" w:semiHidden="1" w:unhideWhenUsed="1"/>
+    <w:lsdException w:name="List Continue 5" w:semiHidden="1" w:unhideWhenUsed="1"/>
+    <w:lsdException w:name="Message Header" w:semiHidden="1" w:unhideWhenUsed="1"/>
+    <w:lsdException w:name="Subtitle" w:qFormat="1" w:uiPriority="11"/>
+    <w:lsdException w:name="Salutation" w:semiHidden="1" w:unhideWhenUsed="1"/>
+    <w:lsdException w:name="Date" w:semiHidden="1" w:unhideWhenUsed="1"/>
+    <w:lsdException w:name="Body Text First Indent" w:semiHidden="1" w:unhideWhenUsed="1"/>
+    <w:lsdException w:name="Body Text First Indent 2" w:semiHidden="1" w:unhideWhenUsed="1"/>
+    <w:lsdException w:name="Note Heading" w:semiHidden="1" w:unhideWhenUsed="1"/>
+    <w:lsdException w:name="Body Text 2" w:semiHidden="1" w:unhideWhenUsed="1"/>
+    <w:lsdException w:name="Body Text 3" w:semiHidden="1" w:unhideWhenUsed="1"/>
+    <w:lsdException w:name="Body Text Indent 2" w:semiHidden="1" w:unhideWhenUsed="1"/>
+    <w:lsdException w:name="Body Text Indent 3" w:semiHidden="1" w:unhideWhenUsed="1"/>
+    <w:lsdException w:name="Block Text" w:semiHidden="1" w:unhideWhenUsed="1"/>
+    <w:lsdException w:name="Hyperlink" w:semiHidden="1" w:unhideWhenUsed="1"/>
+    <w:lsdException w:name="FollowedHyperlink" w:semiHidden="1" w:unhideWhenUsed="1"/>
+    <w:lsdException w:name="Strong" w:qFormat="1" w:uiPriority="22"/>
+    <w:lsdException w:name="Emphasis" w:qFormat="1" w:uiPriority="20"/>
+    <w:lsdException w:name="Document Map" w:semiHidden="1" w:unhideWhenUsed="1"/>
+    <w:lsdException w:name="Plain Text" w:semiHidden="1" w:unhideWhenUsed="1"/>
+    <w:lsdException w:name="E-mail Signature" w:semiHidden="1" w:unhideWhenUsed="1"/>
+    <w:lsdException w:name="HTML Top of Form" w:semiHidden="1" w:unhideWhenUsed="1"/>
+    <w:lsdException w:name="HTML Bottom of Form" w:semiHidden="1" w:unhideWhenUsed="1"/>
+    <w:lsdException w:name="Normal (Web)" w:semiHidden="1" w:unhideWhenUsed="1"/>
+    <w:lsdException w:name="HTML Acronym" w:semiHidden="1" w:unhideWhenUsed="1"/>
+    <w:lsdException w:name="HTML Address" w:semiHidden="1" w:unhideWhenUsed="1"/>
+    <w:lsdException w:name="HTML Cite" w:semiHidden="1" w:unhideWhenUsed="1"/>
+    <w:lsdException w:name="HTML Code" w:semiHidden="1" w:unhideWhenUsed="1"/>
+    <w:lsdException w:name="HTML Definition" w:semiHidden="1" w:unhideWhenUsed="1"/>
+    <w:lsdException w:name="HTML Keyboard" w:semiHidden="1" w:unhideWhenUsed="1"/>
+    <w:lsdException w:name="HTML Preformatted" w:semiHidden="1" w:unhideWhenUsed="1"/>
+    <w:lsdException w:name="HTML Sample" w:semiHidden="1" w:unhideWhenUsed="1"/>
+    <w:lsdException w:name="HTML Typewriter" w:semiHidden="1" w:unhideWhenUsed="1"/>
+    <w:lsdException w:name="HTML Variable" w:semiHidden="1" w:unhideWhenUsed="1"/>
+    <w:lsdException w:name="Normal Table" w:semiHidden="1" w:unhideWhenUsed="1"/>
+    <w:lsdException w:name="annotation subject" w:semiHidden="1" w:unhideWhenUsed="1"/>
+    <w:lsdException w:name="No List" w:semiHidden="1" w:unhideWhenUsed="1"/>
+    <w:lsdException w:name="Outline List 1" w:semiHidden="1" w:unhideWhenUsed="1"/>
+    <w:lsdException w:name="Outline List 2" w:semiHidden="1" w:unhideWhenUsed="1"/>
+    <w:lsdException w:name="Outline List 3" w:semiHidden="1" w:unhideWhenUsed="1"/>
+    <w:lsdException w:name="Table Simple 1" w:semiHidden="1" w:unhideWhenUsed="1"/>
+    <w:lsdException w:name="Table Simple 2" w:semiHidden="1" w:unhideWhenUsed="1"/>
+    <w:lsdException w:name="Table Simple 3" w:semiHidden="1" w:unhideWhenUsed="1"/>
+    <w:lsdException w:name="Table Classic 1" w:semiHidden="1" w:unhideWhenUsed="1"/>
+    <w:lsdException w:name="Table Classic 2" w:semiHidden="1" w:unhideWhenUsed="1"/>
+    <w:lsdException w:name="Table Classic 3" w:semiHidden="1" w:unhideWhenUsed="1"/>
+    <w:lsdException w:name="Table Classic 4" w:semiHidden="1" w:unhideWhenUsed="1"/>
+    <w:lsdException w:name="Table Colorful 1" w:semiHidden="1" w:unhideWhenUsed="1"/>
+    <w:lsdException w:name="Table Colorful 2" w:semiHidden="1" w:unhideWhenUsed="1"/>
+    <w:lsdException w:name="Table Colorful 3" w:semiHidden="1" w:unhideWhenUsed="1"/>
+    <w:lsdException w:name="Table Columns 1" w:semiHidden="1" w:unhideWhenUsed="1"/>
+    <w:lsdException w:name="Table Columns 2" w:semiHidden="1" w:unhideWhenUsed="1"/>
+    <w:lsdException w:name="Table Columns 3" w:semiHidden="1" w:unhideWhenUsed="1"/>
+    <w:lsdException w:name="Table Columns 4" w:semiHidden="1" w:unhideWhenUsed="1"/>
+    <w:lsdException w:name="Table Columns 5" w:semiHidden="1" w:unhideWhenUsed="1"/>
+    <w:lsdException w:name="Table Grid 1" w:semiHidden="1" w:unhideWhenUsed="1"/>
+    <w:lsdException w:name="Table Grid 2" w:semiHidden="1" w:unhideWhenUsed="1"/>
+    <w:lsdException w:name="Table Grid 3" w:semiHidden="1" w:unhideWhenUsed="1"/>
+    <w:lsdException w:name="Table Grid 4" w:semiHidden="1" w:unhideWhenUsed="1"/>
+    <w:lsdException w:name="Table Grid 5" w:semiHidden="1" w:unhideWhenUsed="1"/>
+    <w:lsdException w:name="Table Grid 6" w:semiHidden="1" w:unhideWhenUsed="1"/>
+    <w:lsdException w:name="Table Grid 7" w:semiHidden="1" w:unhideWhenUsed="1"/>
+    <w:lsdException w:name="Table Grid 8" w:semiHidden="1" w:unhideWhenUsed="1"/>
+    <w:lsdException w:name="Table List 1" w:semiHidden="1" w:unhideWhenUsed="1"/>
+    <w:lsdException w:name="Table List 2" w:semiHidden="1" w:unhideWhenUsed="1"/>
+    <w:lsdException w:name="Table List 3" w:semiHidden="1" w:unhideWhenUsed="1"/>
+    <w:lsdException w:name="Table List 4" w:semiHidden="1" w:unhideWhenUsed="1"/>
+    <w:lsdException w:name="Table List 5" w:semiHidden="1" w:unhideWhenUsed="1"/>
+    <w:lsdException w:name="Table List 6" w:semiHidden="1" w:unhideWhenUsed="1"/>
+    <w:lsdException w:name="Table List 7" w:semiHidden="1" w:unhideWhenUsed="1"/>
+    <w:lsdException w:name="Table List 8" w:semiHidden="1" w:unhideWhenUsed="1"/>
+    <w:lsdException w:name="Table 3D effects 1" w:semiHidden="1" w:unhideWhenUsed="1"/>
+    <w:lsdException w:name="Table 3D effects 2" w:semiHidden="1" w:unhideWhenUsed="1"/>
+    <w:lsdException w:name="Table 3D effects 3" w:semiHidden="1" w:unhideWhenUsed="1"/>
+    <w:lsdException w:name="Table Contemporary" w:semiHidden="1" w:unhideWhenUsed="1"/>
+    <w:lsdException w:name="Table Elegant" w:semiHidden="1" w:unhideWhenUsed="1"/>
+    <w:lsdException w:name="Table Professional" w:semiHidden="1" w:unhideWhenUsed="1"/>
+    <w:lsdException w:name="Table Subtle 1" w:semiHidden="1" w:unhideWhenUsed="1"/>
+    <w:lsdException w:name="Table Subtle 2" w:semiHidden="1" w:unhideWhenUsed="1"/>
+    <w:lsdException w:name="Table Web 1" w:semiHidden="1" w:unhideWhenUsed="1"/>
+    <w:lsdException w:name="Table Web 2" w:semiHidden="1" w:unhideWhenUsed="1"/>
+    <w:lsdException w:name="Table Web 3" w:semiHidden="1" w:unhideWhenUsed="1"/>
+    <w:lsdException w:name="Balloon Text" w:semiHidden="1" w:unhideWhenUsed="1"/>
+    <w:lsdException w:name="Table Grid" w:uiPriority="59"/>
+    <w:lsdException w:name="Table Theme" w:semiHidden="1" w:unhideWhenUsed="1"/>
+    <w:lsdException w:name="Placeholder Text" w:semiHidden="1"/>
+    <w:lsdException w:name="No Spacing" w:qFormat="1" w:uiPriority="1"/>
+    <w:lsdException w:name="Light Shading" w:uiPriority="60"/>
+    <w:lsdException w:name="Light List" w:uiPriority="61"/>
+    <w:lsdException w:name="Light Grid" w:uiPriority="62"/>
+    <w:lsdException w:name="Medium Shading 1" w:uiPriority="63"/>
+    <w:lsdException w:name="Medium Shading 2" w:uiPriority="64"/>
+    <w:lsdException w:name="Medium List 1" w:uiPriority="65"/>
+    <w:lsdException w:name="Medium List 2" w:uiPriority="66"/>
+    <w:lsdException w:name="Medium Grid 1" w:uiPriority="67"/>
+    <w:lsdException w:name="Medium Grid 2" w:uiPriority="68"/>
+    <w:lsdException w:name="Medium Grid 3" w:uiPriority="69"/>
+    <w:lsdException w:name="Dark List" w:uiPriority="70"/>
+    <w:lsdException w:name="Colorful Shading" w:uiPriority="71"/>
+    <w:lsdException w:name="Colorful List" w:uiPriority="72"/>
+    <w:lsdException w:name="Colorful Grid" w:uiPriority="73"/>
+    <w:lsdException w:name="Light Shading Accent 1" w:uiPriority="60"/>
+    <w:lsdException w:name="Light List Accent 1" w:uiPriority="61"/>
+    <w:lsdException w:name="Light Grid Accent 1" w:uiPriority="62"/>
+    <w:lsdException w:name="Medium Shading 1 Accent 1" w:uiPriority="63"/>
+    <w:lsdException w:name="Medium Shading 2 Accent 1" w:uiPriority="64"/>
+    <w:lsdException w:name="Medium List 1 Accent 1" w:uiPriority="65"/>
+    <w:lsdException w:name="Revision" w:semiHidden="1"/>
+    <w:lsdException w:name="List Paragraph" w:qFormat="1" w:uiPriority="34"/>
+    <w:lsdException w:name="Quote" w:qFormat="1" w:uiPriority="29"/>
+    <w:lsdException w:name="Intense Quote" w:qFormat="1" w:uiPriority="30"/>
+    <w:lsdException w:name="Medium List 2 Accent 1" w:uiPriority="66"/>
+    <w:lsdException w:name="Medium Grid 1 Accent 1" w:uiPriority="67"/>
+    <w:lsdException w:name="Medium Grid 2 Accent 1" w:uiPriority="68"/>
+    <w:lsdException w:name="Medium Grid 3 Accent 1" w:uiPriority="69"/>
+    <w:lsdException w:name="Dark List Accent 1" w:uiPriority="70"/>
+    <w:lsdException w:name="Colorful Shading Accent 1" w:uiPriority="71"/>
+    <w:lsdException w:name="Colorful List Accent 1" w:uiPriority="72"/>
+    <w:lsdException w:name="Colorful Grid Accent 1" w:uiPriority="73"/>
+    <w:lsdException w:name="Light Shading Accent 2" w:uiPriority="60"/>
+    <w:lsdException w:name="Light List Accent 2" w:uiPriority="61"/>
+    <w:lsdException w:name="Light Grid Accent 2" w:uiPriority="62"/>
+    <w:lsdException w:name="Medium Shading 1 Accent 2" w:uiPriority="63"/>
+    <w:lsdException w:name="Medium Shading 2 Accent 2" w:uiPriority="64"/>
+    <w:lsdException w:name="Medium List 1 Accent 2" w:uiPriority="65"/>
+    <w:lsdException w:name="Medium List 2 Accent 2" w:uiPriority="66"/>
+    <w:lsdException w:name="Medium Grid 1 Accent 2" w:uiPriority="67"/>
+    <w:lsdException w:name="Medium Grid 2 Accent 2" w:uiPriority="68"/>
+    <w:lsdException w:name="Medium Grid 3 Accent 2" w:uiPriority="69"/>
+    <w:lsdException w:name="Dark List Accent 2" w:uiPriority="70"/>
+    <w:lsdException w:name="Colorful Shading Accent 2" w:uiPriority="71"/>
+    <w:lsdException w:name="Colorful List Accent 2" w:uiPriority="72"/>
+    <w:lsdException w:name="Colorful Grid Accent 2" w:uiPriority="73"/>
+    <w:lsdException w:name="Light Shading Accent 3" w:uiPriority="60"/>
+    <w:lsdException w:name="Light List Accent 3" w:uiPriority="61"/>
+    <w:lsdException w:name="Light Grid Accent 3" w:uiPriority="62"/>
+    <w:lsdException w:name="Medium Shading 1 Accent 3" w:uiPriority="63"/>
+    <w:lsdException w:name="Medium Shading 2 Accent 3" w:uiPriority="64"/>
+    <w:lsdException w:name="Medium List 1 Accent 3" w:uiPriority="65"/>
+    <w:lsdException w:name="Medium List 2 Accent 3" w:uiPriority="66"/>
+    <w:lsdException w:name="Medium Grid 1 Accent 3" w:uiPriority="67"/>
+    <w:lsdException w:name="Medium Grid 2 Accent 3" w:uiPriority="68"/>
+    <w:lsdException w:name="Medium Grid 3 Accent 3" w:uiPriority="69"/>
+    <w:lsdException w:name="Dark List Accent 3" w:uiPriority="70"/>
+    <w:lsdException w:name="Colorful Shading Accent 3" w:uiPriority="71"/>
+    <w:lsdException w:name="Colorful List Accent 3" w:uiPriority="72"/>
+    <w:lsdException w:name="Colorful Grid Accent 3" w:uiPriority="73"/>
+    <w:lsdException w:name="Light Shading Accent 4" w:uiPriority="60"/>
+    <w:lsdException w:name="Light List Accent 4" w:uiPriority="61"/>
+    <w:lsdException w:name="Light Grid Accent 4" w:uiPriority="62"/>
+    <w:lsdException w:name="Medium Shading 1 Accent 4" w:uiPriority="63"/>
+    <w:lsdException w:name="Medium Shading 2 Accent 4" w:uiPriority="64"/>
+    <w:lsdException w:name="Medium List 1 Accent 4" w:uiPriority="65"/>
+    <w:lsdException w:name="Medium List 2 Accent 4" w:uiPriority="66"/>
+    <w:lsdException w:name="Medium Grid 1 Accent 4" w:uiPriority="67"/>
+    <w:lsdException w:name="Medium Grid 2 Accent 4" w:uiPriority="68"/>
+    <w:lsdException w:name="Medium Grid 3 Accent 4" w:uiPriority="69"/>
+    <w:lsdException w:name="Dark List Accent 4" w:uiPriority="70"/>
+    <w:lsdException w:name="Colorful Shading Accent 4" w:uiPriority="71"/>
+    <w:lsdException w:name="Colorful List Accent 4" w:uiPriority="72"/>
+    <w:lsdException w:name="Colorful Grid Accent 4" w:uiPriority="73"/>
+    <w:lsdException w:name="Light Shading Accent 5" w:uiPriority="60"/>
+    <w:lsdException w:name="Light List Accent 5" w:uiPriority="61"/>
+    <w:lsdException w:name="Light Grid Accent 5" w:uiPriority="62"/>
+    <w:lsdException w:name="Medium Shading 1 Accent 5" w:uiPriority="63"/>
+    <w:lsdException w:name="Medium Shading 2 Accent 5" w:uiPriority="64"/>
+    <w:lsdException w:name="Medium List 1 Accent 5" w:uiPriority="65"/>
+    <w:lsdException w:name="Medium List 2 Accent 5" w:uiPriority="66"/>
+    <w:lsdException w:name="Medium Grid 1 Accent 5" w:uiPriority="67"/>
+    <w:lsdException w:name="Medium Grid 2 Accent 5" w:uiPriority="68"/>
+    <w:lsdException w:name="Medium Grid 3 Accent 5" w:uiPriority="69"/>
+    <w:lsdException w:name="Dark List Accent 5" w:uiPriority="70"/>
+    <w:lsdException w:name="Colorful Shading Accent 5" w:uiPriority="71"/>
+    <w:lsdException w:name="Colorful List Accent 5" w:uiPriority="72"/>
+    <w:lsdException w:name="Colorful Grid Accent 5" w:uiPriority="73"/>
+    <w:lsdException w:name="Light Shading Accent 6" w:uiPriority="60"/>
+    <w:lsdException w:name="Light List Accent 6" w:uiPriority="61"/>
+    <w:lsdException w:name="Light Grid Accent 6" w:uiPriority="62"/>
+    <w:lsdException w:name="Medium Shading 1 Accent 6" w:uiPriority="63"/>
+    <w:lsdException w:name="Medium Shading 2 Accent 6" w:uiPriority="64"/>
+    <w:lsdException w:name="Medium List 1 Accent 6" w:uiPriority="65"/>
+    <w:lsdException w:name="Medium List 2 Accent 6" w:uiPriority="66"/>
+    <w:lsdException w:name="Medium Grid 1 Accent 6" w:uiPriority="67"/>
+    <w:lsdException w:name="Medium Grid 2 Accent 6" w:uiPriority="68"/>
+    <w:lsdException w:name="Medium Grid 3 Accent 6" w:uiPriority="69"/>
+    <w:lsdException w:name="Dark List Accent 6" w:uiPriority="70"/>
+    <w:lsdException w:name="Colorful Shading Accent 6" w:uiPriority="71"/>
+    <w:lsdException w:name="Colorful List Accent 6" w:uiPriority="72"/>
+    <w:lsdException w:name="Colorful Grid Accent 6" w:uiPriority="73"/>
+    <w:lsdException w:name="Subtle Emphasis" w:qFormat="1" w:uiPriority="19"/>
+    <w:lsdException w:name="Intense Emphasis" w:qFormat="1" w:uiPriority="21"/>
+    <w:lsdException w:name="Subtle Reference" w:qFormat="1" w:uiPriority="31"/>
+    <w:lsdException w:name="Intense Reference" w:qFormat="1" w:uiPriority="32"/>
+    <w:lsdException w:name="Book Title" w:qFormat="1" w:uiPriority="33"/>
+    <w:lsdException w:name="Bibliography" w:semiHidden="1" w:uiPriority="37" w:unhideWhenUsed="1"/>
+    <w:lsdException w:name="TOC Heading" w:qFormat="1" w:semiHidden="1" w:uiPriority="39" w:unhideWhenUsed="1"/>
+    <w:lsdException w:name="Plain Table 1" w:uiPriority="41"/>
+    <w:lsdException w:name="Plain Table 2" w:uiPriority="42"/>
+    <w:lsdException w:name="Plain Table 3" w:uiPriority="43"/>
+    <w:lsdException w:name="Plain Table 4" w:uiPriority="44"/>
+    <w:lsdException w:name="Plain Table 5" w:uiPriority="45"/>
+    <w:lsdException w:name="Grid Table Light" w:uiPriority="40"/>
+    <w:lsdException w:name="Grid Table 1 Light" w:uiPriority="46"/>
+    <w:lsdException w:name="Grid Table 2" w:uiPriority="47"/>
+    <w:lsdException w:name="Grid Table 3" w:uiPriority="48"/>
+    <w:lsdException w:name="Grid Table 4" w:uiPriority="49"/>
+    <w:lsdException w:name="Grid Table 5 Dark" w:uiPriority="50"/>
+    <w:lsdException w:name="Grid Table 6 Colorful" w:uiPriority="51"/>
+    <w:lsdException w:name="Grid Table 7 Colorful" w:uiPriority="52"/>
+    <w:lsdException w:name="Grid Table 1 Light Accent 1" w:uiPriority="46"/>
+    <w:lsdException w:name="Grid Table 2 Accent 1" w:uiPriority="47"/>
+    <w:lsdException w:name="Grid Table 3 Accent 1" w:uiPriority="48"/>
+    <w:lsdException w:name="Grid Table 4 Accent 1" w:uiPriority="49"/>
+    <w:lsdException w:name="Grid Table 5 Dark Accent 1" w:uiPriority="50"/>
+    <w:lsdException w:name="Grid Table 6 Colorful Accent 1" w:uiPriority="51"/>
+    <w:lsdException w:name="Grid Table 7 Colorful Accent 1" w:uiPriority="52"/>
+    <w:lsdException w:name="Grid Table 1 Light Accent 2" w:uiPriority="46"/>
+    <w:lsdException w:name="Grid Table 2 Accent 2" w:uiPriority="47"/>
+    <w:lsdException w:name="Grid Table 3 Accent 2" w:uiPriority="48"/>
+    <w:lsdException w:name="Grid Table 4 Accent 2" w:uiPriority="49"/>
+    <w:lsdException w:name="Grid Table 5 Dark Accent 2" w:uiPriority="50"/>
+    <w:lsdException w:name="Grid Table 6 Colorful Accent 2" w:uiPriority="51"/>
+    <w:lsdException w:name="Grid Table 7 Colorful Accent 2" w:uiPriority="52"/>
+    <w:lsdException w:name="Grid Table 1 Light Accent 3" w:uiPriority="46"/>
+    <w:lsdException w:name="Grid Table 2 Accent 3" w:uiPriority="47"/>
+    <w:lsdException w:name="Grid Table 3 Accent 3" w:uiPriority="48"/>
+    <w:lsdException w:name="Grid Table 4 Accent 3" w:uiPriority="49"/>
+    <w:lsdException w:name="Grid Table 5 Dark Accent 3" w:uiPriority="50"/>
+    <w:lsdException w:name="Grid Table 6 Colorful Accent 3" w:uiPriority="51"/>
+    <w:lsdException w:name="Grid Table 7 Colorful Accent 3" w:uiPriority="52"/>
+    <w:lsdException w:name="Grid Table 1 Light Accent 4" w:uiPriority="46"/>
+    <w:lsdException w:name="Grid Table 2 Accent 4" w:uiPriority="47"/>
+    <w:lsdException w:name="Grid Table 3 Accent 4" w:uiPriority="48"/>
+    <w:lsdException w:name="Grid Table 4 Accent 4" w:uiPriority="49"/>
+    <w:lsdException w:name="Grid Table 5 Dark Accent 4" w:uiPriority="50"/>
+    <w:lsdException w:name="Grid Table 6 Colorful Accent 4" w:uiPriority="51"/>
+    <w:lsdException w:name="Grid Table 7 Colorful Accent 4" w:uiPriority="52"/>
+    <w:lsdException w:name="Grid Table 1 Light Accent 5" w:uiPriority="46"/>
+    <w:lsdException w:name="Grid Table 2 Accent 5" w:uiPriority="47"/>
+    <w:lsdException w:name="Grid Table 3 Accent 5" w:uiPriority="48"/>
+    <w:lsdException w:name="Grid Table 4 Accent 5" w:uiPriority="49"/>
+    <w:lsdException w:name="Grid Table 5 Dark Accent 5" w:uiPriority="50"/>
+    <w:lsdException w:name="Grid Table 6 Colorful Accent 5" w:uiPriority="51"/>
+    <w:lsdException w:name="Grid Table 7 Colorful Accent 5" w:uiPriority="52"/>
+    <w:lsdException w:name="Grid Table 1 Light Accent 6" w:uiPriority="46"/>
+    <w:lsdException w:name="Grid Table 2 Accent 6" w:uiPriority="47"/>
+    <w:lsdException w:name="Grid Table 3 Accent 6" w:uiPriority="48"/>
+    <w:lsdException w:name="Grid Table 4 Accent 6" w:uiPriority="49"/>
+    <w:lsdException w:name="Grid Table 5 Dark Accent 6" w:uiPriority="50"/>
+    <w:lsdException w:name="Grid Table 6 Colorful Accent 6" w:uiPriority="51"/>
+    <w:lsdException w:name="Grid Table 7 Colorful Accent 6" w:uiPriority="52"/>
+    <w:lsdException w:name="List Table 1 Light" w:uiPriority="46"/>
+    <w:lsdException w:name="List Table 2" w:uiPriority="47"/>
+    <w:lsdException w:name="List Table 3" w:uiPriority="48"/>
+    <w:lsdException w:name="List Table 4" w:uiPriority="49"/>
+    <w:lsdException w:name="List Table 5 Dark" w:uiPriority="50"/>
+    <w:lsdException w:name="List Table 6 Colorful" w:uiPriority="51"/>
+    <w:lsdException w:name="List Table 7 Colorful" w:uiPriority="52"/>
+    <w:lsdException w:name="List Table 1 Light Accent 1" w:uiPriority="46"/>
+    <w:lsdException w:name="List Table 2 Accent 1" w:uiPriority="47"/>
+    <w:lsdException w:name="List Table 3 Accent 1" w:uiPriority="48"/>
+    <w:lsdException w:name="List Table 4 Accent 1" w:uiPriority="49"/>
+    <w:lsdException w:name="List Table 5 Dark Accent 1" w:uiPriority="50"/>
+    <w:lsdException w:name="List Table 6 Colorful Accent 1" w:uiPriority="51"/>
+    <w:lsdException w:name="List Table 7 Colorful Accent 1" w:uiPriority="52"/>
+    <w:lsdException w:name="List Table 1 Light Accent 2" w:uiPriority="46"/>
+    <w:lsdException w:name="List Table 2 Accent 2" w:uiPriority="47"/>
+    <w:lsdException w:name="List Table 3 Accent 2" w:uiPriority="48"/>
+    <w:lsdException w:name="List Table 4 Accent 2" w:uiPriority="49"/>
+    <w:lsdException w:name="List Table 5 Dark Accent 2" w:uiPriority="50"/>
+    <w:lsdException w:name="List Table 6 Colorful Accent 2" w:uiPriority="51"/>
+    <w:lsdException w:name="List Table 7 Colorful Accent 2" w:uiPriority="52"/>
+    <w:lsdException w:name="List Table 1 Light Accent 3" w:uiPriority="46"/>
+    <w:lsdException w:name="List Table 2 Accent 3" w:uiPriority="47"/>
+    <w:lsdException w:name="List Table 3 Accent 3" w:uiPriority="48"/>
+    <w:lsdException w:name="List Table 4 Accent 3" w:uiPriority="49"/>
+    <w:lsdException w:name="List Table 5 Dark Accent 3" w:uiPriority="50"/>
+    <w:lsdException w:name="List Table 6 Colorful Accent 3" w:uiPriority="51"/>
+    <w:lsdException w:name="List Table 7 Colorful Accent 3" w:uiPriority="52"/>
+    <w:lsdException w:name="List Table 1 Light Accent 4" w:uiPriority="46"/>
+    <w:lsdException w:name="List Table 2 Accent 4" w:uiPriority="47"/>
+    <w:lsdException w:name="List Table 3 Accent 4" w:uiPriority="48"/>
+    <w:lsdException w:name="List Table 4 Accent 4" w:uiPriority="49"/>
+    <w:lsdException w:name="List Table 5 Dark Accent 4" w:uiPriority="50"/>
+    <w:lsdException w:name="List Table 6 Colorful Accent 4" w:uiPriority="51"/>
+    <w:lsdException w:name="List Table 7 Colorful Accent 4" w:uiPriority="52"/>
+    <w:lsdException w:name="List Table 1 Light Accent 5" w:uiPriority="46"/>
+    <w:lsdException w:name="List Table 2 Accent 5" w:uiPriority="47"/>
+    <w:lsdException w:name="List Table 3 Accent 5" w:uiPriority="48"/>
+    <w:lsdException w:name="List Table 4 Accent 5" w:uiPriority="49"/>
+    <w:lsdException w:name="List Table 5 Dark Accent 5" w:uiPriority="50"/>
+    <w:lsdException w:name="List Table 6 Colorful Accent 5" w:uiPriority="51"/>
+    <w:lsdException w:name="List Table 7 Colorful Accent 5" w:uiPriority="52"/>
+    <w:lsdException w:name="List Table 1 Light Accent 6" w:uiPriority="46"/>
+    <w:lsdException w:name="List Table 2 Accent 6" w:uiPriority="47"/>
+    <w:lsdException w:name="List Table 3 Accent 6" w:uiPriority="48"/>
+    <w:lsdException w:name="List Table 4 Accent 6" w:uiPriority="49"/>
+    <w:lsdException w:name="List Table 5 Dark Accent 6" w:uiPriority="50"/>
+    <w:lsdException w:name="List Table 6 Colorful Accent 6" w:uiPriority="51"/>
+    <w:lsdException w:name="List Table 7 Colorful Accent 6" w:uiPriority="52"/>
+    <w:lsdException w:name="Mention" w:semiHidden="1" w:unhideWhenUsed="1"/>
+    <w:lsdException w:name="Smart Hyperlink" w:semiHidden="1" w:unhideWhenUsed="1"/>
+    <w:lsdException w:name="Hashtag" w:semiHidden="1" w:unhideWhenUsed="1"/>
+    <w:lsdException w:name="Unresolved Mention" w:semiHidden="1" w:unhideWhenUsed="1"/>
+    <w:lsdException w:name="Smart Link" w:semiHidden="1" w:unhideWhenUsed="1"/>
+  </w:latentStyles>
+  <w:style w:default="1" w:styleId="a" w:type="paragraph">
     <w:name w:val="Normal"/>
     <w:qFormat/>
-  </w:style>
-  <w:style w:styleId="BodyText" w:type="paragraph">
-    <w:name w:val="Body Text"/>
-    <w:basedOn w:val="Normal"/>
-    <w:link w:val="BodyTextChar"/>
-    <w:qFormat/>
-    <w:pPr>
-      <w:spacing w:after="180" w:before="180"/>
-    </w:pPr>
-  </w:style>
-  <w:style w:customStyle="1" w:styleId="FirstParagraph" w:type="paragraph">
-    <w:name w:val="First Paragraph"/>
-    <w:basedOn w:val="BodyText"/>
-    <w:next w:val="BodyText"/>
-    <w:qFormat/>
-  </w:style>
-  <w:style w:customStyle="1" w:styleId="Compact" w:type="paragraph">
-    <w:name w:val="Compact"/>
-    <w:basedOn w:val="BodyText"/>
-    <w:qFormat/>
-    <w:pPr>
-      <w:spacing w:after="36" w:before="36"/>
-    </w:pPr>
-  </w:style>
-  <w:style w:styleId="Title" w:type="paragraph">
-    <w:name w:val="Title"/>
-    <w:basedOn w:val="Normal"/>
-    <w:next w:val="BodyText"/>
-    <w:link w:val="TitleChar"/>
-    <w:uiPriority w:val="10"/>
-    <w:qFormat/>
-    <w:rsid w:val="00A10FD9"/>
-    <w:pPr>
-      <w:spacing w:after="80" w:line="240" w:lineRule="auto"/>
-      <w:contextualSpacing/>
-      <w:jc w:val="center"/>
-    </w:pPr>
-    <w:rPr>
-      <w:rFonts w:asciiTheme="majorHAnsi" w:cstheme="majorBidi" w:eastAsiaTheme="majorEastAsia" w:hAnsiTheme="majorHAnsi"/>
-      <w:sz w:val="56"/>
-      <w:szCs w:val="56"/>
-    </w:rPr>
-  </w:style>
-  <w:style w:customStyle="1" w:styleId="TitleChar" w:type="character">
-    <w:name w:val="Title Char"/>
-    <w:basedOn w:val="DefaultParagraphFont"/>
-    <w:link w:val="Title"/>
-    <w:uiPriority w:val="10"/>
-    <w:rsid w:val="00A10FD9"/>
-    <w:rPr>
-      <w:rFonts w:asciiTheme="majorHAnsi" w:cstheme="majorBidi" w:eastAsiaTheme="majorEastAsia" w:hAnsiTheme="majorHAnsi"/>
-      <w:sz w:val="56"/>
-      <w:szCs w:val="56"/>
-    </w:rPr>
-  </w:style>
-  <w:style w:styleId="Subtitle" w:type="paragraph">
-    <w:name w:val="Subtitle"/>
-    <w:basedOn w:val="Title"/>
-    <w:next w:val="BodyText"/>
-    <w:link w:val="SubtitleChar"/>
-    <w:uiPriority w:val="11"/>
-    <w:qFormat/>
-    <w:rsid w:val="00A10FD9"/>
-    <w:pPr>
-      <w:numPr>
-        <w:ilvl w:val="1"/>
-      </w:numPr>
-    </w:pPr>
-    <w:rPr>
-      <w:rFonts w:cstheme="majorBidi" w:eastAsiaTheme="majorEastAsia"/>
-      <w:spacing w:val="15"/>
-      <w:sz w:val="28"/>
-      <w:szCs w:val="28"/>
-    </w:rPr>
-  </w:style>
-  <w:style w:customStyle="1" w:styleId="SubtitleChar" w:type="character">
-    <w:name w:val="Subtitle Char"/>
-    <w:basedOn w:val="DefaultParagraphFont"/>
-    <w:link w:val="Subtitle"/>
-    <w:uiPriority w:val="11"/>
-    <w:rsid w:val="00A10FD9"/>
-    <w:rPr>
-      <w:rFonts w:cstheme="majorBidi" w:eastAsiaTheme="majorEastAsia"/>
-      <w:color w:themeColor="text1" w:themeTint="A6" w:val="595959"/>
-      <w:spacing w:val="15"/>
-      <w:sz w:val="28"/>
-      <w:szCs w:val="28"/>
-    </w:rPr>
-  </w:style>
-  <w:style w:customStyle="1" w:styleId="Author" w:type="paragraph">
-    <w:name w:val="Author"/>
-    <w:basedOn w:val="Title"/>
-    <w:next w:val="BodyText"/>
-    <w:qFormat/>
-    <w:pPr>
-      <w:keepNext/>
-      <w:keepLines/>
-    </w:pPr>
-    <w:rPr>
+    <w:rsid w:val="002D4E76"/>
+    <w:pPr>
+      <w:spacing w:line="360" w:lineRule="auto"/>
+      <w:ind w:firstLine="200" w:firstLineChars="200"/>
+      <w:jc w:val="both"/>
+    </w:pPr>
+    <w:rPr>
+      <w:rFonts w:eastAsia="宋体"/>
       <w:sz w:val="24"/>
       <w:szCs w:val="24"/>
-    </w:rPr>
-  </w:style>
-  <w:style w:styleId="Date" w:type="paragraph">
-    <w:name w:val="Date"/>
-    <w:basedOn w:val="Title"/>
-    <w:next w:val="BodyText"/>
-    <w:qFormat/>
-    <w:pPr>
-      <w:keepNext/>
-      <w:keepLines/>
-    </w:pPr>
-    <w:rPr>
-      <w:sz w:val="24"/>
-      <w:szCs w:val="24"/>
-    </w:rPr>
-  </w:style>
-  <w:style w:customStyle="1" w:styleId="AbstractTitle" w:type="paragraph">
-    <w:name w:val="Abstract Title"/>
-    <w:basedOn w:val="Normal"/>
-    <w:next w:val="Abstract"/>
-    <w:qFormat/>
-    <w:pPr>
-      <w:keepNext/>
-      <w:keepLines/>
-      <w:spacing w:after="0" w:before="300"/>
-      <w:jc w:val="center"/>
-    </w:pPr>
-    <w:rPr>
-      <w:b/>
-      <w:sz w:val="20"/>
-      <w:szCs w:val="20"/>
-    </w:rPr>
-  </w:style>
-  <w:style w:customStyle="1" w:styleId="Abstract" w:type="paragraph">
-    <w:name w:val="Abstract"/>
-    <w:basedOn w:val="Normal"/>
-    <w:next w:val="BodyText"/>
-    <w:qFormat/>
-    <w:pPr>
-      <w:keepNext/>
-      <w:keepLines/>
-      <w:spacing w:after="300" w:before="100"/>
-    </w:pPr>
-    <w:rPr>
-      <w:sz w:val="20"/>
-      <w:szCs w:val="20"/>
-    </w:rPr>
-  </w:style>
-  <w:style w:styleId="Bibliography" w:type="paragraph">
-    <w:name w:val="Bibliography"/>
-    <w:basedOn w:val="Normal"/>
-    <w:next w:val="Bibliography"/>
-    <w:qFormat/>
-    <w:pPr/>
-    <w:rPr/>
-  </w:style>
-  <w:style w:styleId="Heading1" w:type="paragraph">
+      <w:lang w:eastAsia="ja-JP" w:val="de-DE"/>
+    </w:rPr>
+  </w:style>
+  <w:style w:styleId="1" w:type="paragraph">
     <w:name w:val="heading 1"/>
-    <w:basedOn w:val="Normal"/>
-    <w:next w:val="BodyText"/>
-    <w:link w:val="Heading1Char"/>
+    <w:basedOn w:val="Legend"/>
+    <w:next w:val="a"/>
+    <w:link w:val="10"/>
     <w:uiPriority w:val="9"/>
     <w:qFormat/>
-    <w:rsid w:val="00A10FD9"/>
-    <w:pPr>
-      <w:keepNext/>
-      <w:keepLines/>
-      <w:spacing w:after="80" w:before="360"/>
+    <w:rsid w:val="004363EA"/>
+    <w:pPr>
+      <w:ind w:firstLine="0" w:firstLineChars="0"/>
+      <w:jc w:val="left"/>
       <w:outlineLvl w:val="0"/>
     </w:pPr>
     <w:rPr>
-      <w:rFonts w:asciiTheme="majorHAnsi" w:cstheme="majorBidi" w:eastAsiaTheme="majorEastAsia" w:hAnsiTheme="majorHAnsi"/>
-      <w:color w:themeColor="accent1" w:themeShade="BF" w:val="0F4761"/>
-      <w:sz w:val="40"/>
-      <w:szCs w:val="40"/>
-    </w:rPr>
-  </w:style>
-  <w:style w:styleId="Heading2" w:type="paragraph">
+      <w:b/>
+      <w:noProof/>
+      <w:sz w:val="32"/>
+    </w:rPr>
+  </w:style>
+  <w:style w:styleId="2" w:type="paragraph">
     <w:name w:val="heading 2"/>
-    <w:basedOn w:val="Normal"/>
-    <w:next w:val="BodyText"/>
-    <w:link w:val="Heading2Char"/>
-    <w:uiPriority w:val="9"/>
-    <w:semiHidden/>
-    <w:unhideWhenUsed/>
-    <w:qFormat/>
-    <w:rsid w:val="00A10FD9"/>
-    <w:pPr>
-      <w:keepNext/>
-      <w:keepLines/>
-      <w:spacing w:after="80" w:before="160"/>
-      <w:outlineLvl w:val="1"/>
-    </w:pPr>
-    <w:rPr>
-      <w:rFonts w:asciiTheme="majorHAnsi" w:cstheme="majorBidi" w:eastAsiaTheme="majorEastAsia" w:hAnsiTheme="majorHAnsi"/>
-      <w:color w:themeColor="accent1" w:themeShade="BF" w:val="0F4761"/>
-      <w:sz w:val="32"/>
-      <w:szCs w:val="32"/>
-    </w:rPr>
-  </w:style>
-  <w:style w:styleId="Heading3" w:type="paragraph">
-    <w:name w:val="heading 3"/>
-    <w:basedOn w:val="Normal"/>
-    <w:next w:val="BodyText"/>
-    <w:link w:val="Heading3Char"/>
-    <w:uiPriority w:val="9"/>
-    <w:semiHidden/>
-    <w:unhideWhenUsed/>
-    <w:qFormat/>
-    <w:rsid w:val="00A10FD9"/>
-    <w:pPr>
-      <w:keepNext/>
-      <w:keepLines/>
-      <w:spacing w:after="80" w:before="160"/>
-      <w:outlineLvl w:val="2"/>
-    </w:pPr>
-    <w:rPr>
-      <w:rFonts w:cstheme="majorBidi" w:eastAsiaTheme="majorEastAsia"/>
-      <w:color w:themeColor="accent1" w:themeShade="BF" w:val="0F4761"/>
-      <w:sz w:val="28"/>
-      <w:szCs w:val="28"/>
-    </w:rPr>
-  </w:style>
-  <w:style w:styleId="Heading4" w:type="paragraph">
-    <w:name w:val="heading 4"/>
-    <w:basedOn w:val="Normal"/>
-    <w:next w:val="BodyText"/>
-    <w:link w:val="Heading4Char"/>
-    <w:uiPriority w:val="9"/>
-    <w:semiHidden/>
-    <w:unhideWhenUsed/>
-    <w:qFormat/>
-    <w:rsid w:val="00A10FD9"/>
-    <w:pPr>
-      <w:keepNext/>
-      <w:keepLines/>
-      <w:spacing w:after="40" w:before="80"/>
-      <w:outlineLvl w:val="3"/>
-    </w:pPr>
-    <w:rPr>
-      <w:rFonts w:cstheme="majorBidi" w:eastAsiaTheme="majorEastAsia"/>
-      <w:i/>
-      <w:iCs/>
-      <w:color w:themeColor="accent1" w:themeShade="BF" w:val="0F4761"/>
-    </w:rPr>
-  </w:style>
-  <w:style w:styleId="Heading5" w:type="paragraph">
-    <w:name w:val="heading 5"/>
-    <w:basedOn w:val="Normal"/>
-    <w:next w:val="BodyText"/>
-    <w:link w:val="Heading5Char"/>
-    <w:uiPriority w:val="9"/>
-    <w:semiHidden/>
-    <w:unhideWhenUsed/>
-    <w:qFormat/>
-    <w:rsid w:val="00A10FD9"/>
-    <w:pPr>
-      <w:keepNext/>
-      <w:keepLines/>
-      <w:spacing w:after="40" w:before="80"/>
-      <w:outlineLvl w:val="4"/>
-    </w:pPr>
-    <w:rPr>
-      <w:rFonts w:cstheme="majorBidi" w:eastAsiaTheme="majorEastAsia"/>
-      <w:color w:themeColor="accent1" w:themeShade="BF" w:val="0F4761"/>
-    </w:rPr>
-  </w:style>
-  <w:style w:styleId="Heading6" w:type="paragraph">
-    <w:name w:val="heading 6"/>
-    <w:basedOn w:val="Normal"/>
-    <w:next w:val="BodyText"/>
-    <w:link w:val="Heading6Char"/>
-    <w:uiPriority w:val="9"/>
-    <w:semiHidden/>
-    <w:unhideWhenUsed/>
-    <w:qFormat/>
-    <w:rsid w:val="00A10FD9"/>
-    <w:pPr>
-      <w:keepNext/>
-      <w:keepLines/>
-      <w:spacing w:after="0" w:before="40"/>
-      <w:outlineLvl w:val="5"/>
-    </w:pPr>
-    <w:rPr>
-      <w:rFonts w:cstheme="majorBidi" w:eastAsiaTheme="majorEastAsia"/>
-      <w:i/>
-      <w:iCs/>
-      <w:color w:themeColor="text1" w:themeTint="A6" w:val="595959"/>
-    </w:rPr>
-  </w:style>
-  <w:style w:styleId="Heading7" w:type="paragraph">
-    <w:name w:val="heading 7"/>
-    <w:basedOn w:val="Normal"/>
-    <w:next w:val="BodyText"/>
-    <w:link w:val="Heading7Char"/>
-    <w:uiPriority w:val="9"/>
-    <w:semiHidden/>
-    <w:unhideWhenUsed/>
-    <w:qFormat/>
-    <w:rsid w:val="00A10FD9"/>
-    <w:pPr>
-      <w:keepNext/>
-      <w:keepLines/>
-      <w:spacing w:after="0" w:before="40"/>
-      <w:outlineLvl w:val="6"/>
-    </w:pPr>
-    <w:rPr>
-      <w:rFonts w:cstheme="majorBidi" w:eastAsiaTheme="majorEastAsia"/>
-      <w:color w:themeColor="text1" w:themeTint="A6" w:val="595959"/>
-    </w:rPr>
-  </w:style>
-  <w:style w:styleId="Heading8" w:type="paragraph">
-    <w:name w:val="heading 8"/>
-    <w:basedOn w:val="Normal"/>
-    <w:next w:val="BodyText"/>
-    <w:link w:val="Heading8Char"/>
-    <w:uiPriority w:val="9"/>
-    <w:semiHidden/>
-    <w:unhideWhenUsed/>
-    <w:qFormat/>
-    <w:rsid w:val="00A10FD9"/>
-    <w:pPr>
-      <w:keepNext/>
-      <w:keepLines/>
-      <w:spacing w:after="0"/>
-      <w:outlineLvl w:val="7"/>
-    </w:pPr>
-    <w:rPr>
-      <w:rFonts w:cstheme="majorBidi" w:eastAsiaTheme="majorEastAsia"/>
-      <w:i/>
-      <w:iCs/>
-      <w:color w:themeColor="text1" w:themeTint="D8" w:val="272727"/>
-    </w:rPr>
-  </w:style>
-  <w:style w:styleId="Heading9" w:type="paragraph">
-    <w:name w:val="heading 9"/>
-    <w:basedOn w:val="Normal"/>
-    <w:next w:val="BodyText"/>
-    <w:link w:val="Heading9Char"/>
-    <w:uiPriority w:val="9"/>
-    <w:semiHidden/>
-    <w:unhideWhenUsed/>
-    <w:qFormat/>
-    <w:rsid w:val="00A10FD9"/>
-    <w:pPr>
-      <w:keepNext/>
-      <w:keepLines/>
-      <w:spacing w:after="0"/>
-      <w:outlineLvl w:val="8"/>
-    </w:pPr>
-    <w:rPr>
-      <w:rFonts w:cstheme="majorBidi" w:eastAsiaTheme="majorEastAsia"/>
-      <w:color w:themeColor="text1" w:themeTint="D8" w:val="272727"/>
-    </w:rPr>
-  </w:style>
-  <w:style w:customStyle="1" w:styleId="Heading1Char" w:type="character">
-    <w:name w:val="Heading 1 Char"/>
-    <w:basedOn w:val="DefaultParagraphFont"/>
-    <w:link w:val="Heading1"/>
-    <w:uiPriority w:val="9"/>
-    <w:rsid w:val="00A10FD9"/>
-    <w:rPr>
-      <w:rFonts w:asciiTheme="majorHAnsi" w:cstheme="majorBidi" w:eastAsiaTheme="majorEastAsia" w:hAnsiTheme="majorHAnsi"/>
-      <w:color w:themeColor="accent1" w:themeShade="BF" w:val="0F4761"/>
-      <w:sz w:val="40"/>
-      <w:szCs w:val="40"/>
-    </w:rPr>
-  </w:style>
-  <w:style w:customStyle="1" w:styleId="Heading2Char" w:type="character">
-    <w:name w:val="Heading 2 Char"/>
-    <w:basedOn w:val="DefaultParagraphFont"/>
-    <w:link w:val="Heading2"/>
-    <w:uiPriority w:val="9"/>
-    <w:semiHidden/>
-    <w:rsid w:val="00A10FD9"/>
-    <w:rPr>
-      <w:rFonts w:asciiTheme="majorHAnsi" w:cstheme="majorBidi" w:eastAsiaTheme="majorEastAsia" w:hAnsiTheme="majorHAnsi"/>
-      <w:color w:themeColor="accent1" w:themeShade="BF" w:val="0F4761"/>
-      <w:sz w:val="32"/>
-      <w:szCs w:val="32"/>
-    </w:rPr>
-  </w:style>
-  <w:style w:customStyle="1" w:styleId="Heading3Char" w:type="character">
-    <w:name w:val="Heading 3 Char"/>
-    <w:basedOn w:val="DefaultParagraphFont"/>
-    <w:link w:val="Heading3"/>
-    <w:uiPriority w:val="9"/>
-    <w:semiHidden/>
-    <w:rsid w:val="00A10FD9"/>
-    <w:rPr>
-      <w:rFonts w:cstheme="majorBidi" w:eastAsiaTheme="majorEastAsia"/>
-      <w:color w:themeColor="accent1" w:themeShade="BF" w:val="0F4761"/>
-      <w:sz w:val="28"/>
-      <w:szCs w:val="28"/>
-    </w:rPr>
-  </w:style>
-  <w:style w:customStyle="1" w:styleId="Heading4Char" w:type="character">
-    <w:name w:val="Heading 4 Char"/>
-    <w:basedOn w:val="DefaultParagraphFont"/>
-    <w:link w:val="Heading4"/>
-    <w:uiPriority w:val="9"/>
-    <w:semiHidden/>
-    <w:rsid w:val="00A10FD9"/>
-    <w:rPr>
-      <w:rFonts w:cstheme="majorBidi" w:eastAsiaTheme="majorEastAsia"/>
-      <w:i/>
-      <w:iCs/>
-      <w:color w:themeColor="accent1" w:themeShade="BF" w:val="0F4761"/>
-    </w:rPr>
-  </w:style>
-  <w:style w:customStyle="1" w:styleId="Heading5Char" w:type="character">
-    <w:name w:val="Heading 5 Char"/>
-    <w:basedOn w:val="DefaultParagraphFont"/>
-    <w:link w:val="Heading5"/>
-    <w:uiPriority w:val="9"/>
-    <w:semiHidden/>
-    <w:rsid w:val="00A10FD9"/>
-    <w:rPr>
-      <w:rFonts w:cstheme="majorBidi" w:eastAsiaTheme="majorEastAsia"/>
-      <w:color w:themeColor="accent1" w:themeShade="BF" w:val="0F4761"/>
-    </w:rPr>
-  </w:style>
-  <w:style w:customStyle="1" w:styleId="Heading6Char" w:type="character">
-    <w:name w:val="Heading 6 Char"/>
-    <w:basedOn w:val="DefaultParagraphFont"/>
-    <w:link w:val="Heading6"/>
-    <w:uiPriority w:val="9"/>
-    <w:semiHidden/>
-    <w:rsid w:val="00A10FD9"/>
-    <w:rPr>
-      <w:rFonts w:cstheme="majorBidi" w:eastAsiaTheme="majorEastAsia"/>
-      <w:i/>
-      <w:iCs/>
-      <w:color w:themeColor="text1" w:themeTint="A6" w:val="595959"/>
-    </w:rPr>
-  </w:style>
-  <w:style w:customStyle="1" w:styleId="Heading7Char" w:type="character">
-    <w:name w:val="Heading 7 Char"/>
-    <w:basedOn w:val="DefaultParagraphFont"/>
-    <w:link w:val="Heading7"/>
-    <w:uiPriority w:val="9"/>
-    <w:semiHidden/>
-    <w:rsid w:val="00A10FD9"/>
-    <w:rPr>
-      <w:rFonts w:cstheme="majorBidi" w:eastAsiaTheme="majorEastAsia"/>
-      <w:color w:themeColor="text1" w:themeTint="A6" w:val="595959"/>
-    </w:rPr>
-  </w:style>
-  <w:style w:customStyle="1" w:styleId="Heading8Char" w:type="character">
-    <w:name w:val="Heading 8 Char"/>
-    <w:basedOn w:val="DefaultParagraphFont"/>
-    <w:link w:val="Heading8"/>
-    <w:uiPriority w:val="9"/>
-    <w:semiHidden/>
-    <w:rsid w:val="00A10FD9"/>
-    <w:rPr>
-      <w:rFonts w:cstheme="majorBidi" w:eastAsiaTheme="majorEastAsia"/>
-      <w:i/>
-      <w:iCs/>
-      <w:color w:themeColor="text1" w:themeTint="D8" w:val="272727"/>
-    </w:rPr>
-  </w:style>
-  <w:style w:customStyle="1" w:styleId="Heading9Char" w:type="character">
-    <w:name w:val="Heading 9 Char"/>
-    <w:basedOn w:val="DefaultParagraphFont"/>
-    <w:link w:val="Heading9"/>
-    <w:uiPriority w:val="9"/>
-    <w:semiHidden/>
-    <w:rsid w:val="00A10FD9"/>
-    <w:rPr>
-      <w:rFonts w:cstheme="majorBidi" w:eastAsiaTheme="majorEastAsia"/>
-      <w:color w:themeColor="text1" w:themeTint="D8" w:val="272727"/>
-    </w:rPr>
-  </w:style>
-  <w:style w:styleId="BlockText" w:type="paragraph">
-    <w:name w:val="Block Text"/>
-    <w:basedOn w:val="BodyText"/>
-    <w:next w:val="BodyText"/>
+    <w:next w:val="a"/>
+    <w:link w:val="20"/>
     <w:uiPriority w:val="9"/>
     <w:unhideWhenUsed/>
     <w:qFormat/>
-    <w:pPr>
-      <w:spacing w:after="100" w:before="100"/>
-      <w:ind w:firstLine="0" w:left="480" w:right="480"/>
-    </w:pPr>
-  </w:style>
-  <w:style w:styleId="FootnoteText" w:type="paragraph">
-    <w:name w:val="Footnote Text"/>
-    <w:basedOn w:val="Normal"/>
-    <w:next w:val="FootnoteText"/>
+    <w:rsid w:val="00536AFB"/>
+    <w:pPr>
+      <w:spacing w:line="360" w:lineRule="auto"/>
+      <w:outlineLvl w:val="1"/>
+    </w:pPr>
+    <w:rPr>
+      <w:rFonts w:eastAsia="宋体"/>
+      <w:b/>
+      <w:noProof/>
+      <w:sz w:val="30"/>
+      <w:szCs w:val="24"/>
+      <w:lang w:eastAsia="ja-JP" w:val="en-US"/>
+    </w:rPr>
+  </w:style>
+  <w:style w:styleId="3" w:type="paragraph">
+    <w:name w:val="heading 3"/>
+    <w:next w:val="a"/>
+    <w:link w:val="30"/>
     <w:uiPriority w:val="9"/>
     <w:unhideWhenUsed/>
     <w:qFormat/>
-  </w:style>
-  <w:style w:styleId="FootnoteBlockText" w:type="paragraph">
-    <w:name w:val="Footnote Block Text"/>
-    <w:basedOn w:val="FootnoteText"/>
-    <w:next w:val="FootnoteText"/>
-    <w:uiPriority w:val="9"/>
-    <w:unhideWhenUsed/>
-    <w:qFormat/>
-    <w:pPr>
-      <w:spacing w:after="100" w:before="100"/>
-      <w:ind w:firstLine="0" w:left="480" w:right="480"/>
-    </w:pPr>
-  </w:style>
-  <w:style w:default="1" w:styleId="DefaultParagraphFont" w:type="character">
+    <w:rsid w:val="00536AFB"/>
+    <w:pPr>
+      <w:spacing w:line="360" w:lineRule="auto"/>
+      <w:outlineLvl w:val="2"/>
+    </w:pPr>
+    <w:rPr>
+      <w:rFonts w:eastAsia="宋体"/>
+      <w:b/>
+      <w:sz w:val="24"/>
+      <w:szCs w:val="24"/>
+      <w:lang w:eastAsia="ja-JP" w:val="de-DE"/>
+    </w:rPr>
+  </w:style>
+  <w:style w:default="1" w:styleId="a0" w:type="character">
     <w:name w:val="Default Paragraph Font"/>
+    <w:uiPriority w:val="1"/>
     <w:semiHidden/>
     <w:unhideWhenUsed/>
   </w:style>
-  <w:style w:default="1" w:styleId="Table" w:type="table">
-    <w:name w:val="Table"/>
-    <w:basedOn w:val="TableNormal"/>
+  <w:style w:default="1" w:styleId="a1" w:type="table">
+    <w:name w:val="Normal Table"/>
+    <w:uiPriority w:val="99"/>
     <w:semiHidden/>
     <w:unhideWhenUsed/>
-    <w:qFormat/>
     <w:tblPr>
       <w:tblInd w:type="dxa" w:w="0"/>
       <w:tblCellMar>
@@ -1529,112 +1890,776 @@
         <w:right w:type="dxa" w:w="108"/>
       </w:tblCellMar>
     </w:tblPr>
-    <w:tblStylePr w:type="firstRow">
-      <w:tcPr>
-        <w:tcBorders>
-          <w:bottom w:val="single"/>
-        </w:tcBorders>
-        <w:vAlign w:val="bottom"/>
-      </w:tcPr>
-    </w:tblStylePr>
-  </w:style>
-  <w:style w:customStyle="1" w:styleId="DefinitionTerm" w:type="paragraph">
-    <w:name w:val="Definition Term"/>
-    <w:basedOn w:val="Normal"/>
-    <w:next w:val="Definition"/>
-    <w:pPr>
-      <w:keepNext/>
+  </w:style>
+  <w:style w:default="1" w:styleId="a2" w:type="numbering">
+    <w:name w:val="No List"/>
+    <w:uiPriority w:val="99"/>
+    <w:semiHidden/>
+    <w:unhideWhenUsed/>
+  </w:style>
+  <w:style w:customStyle="1" w:styleId="History" w:type="paragraph">
+    <w:name w:val="History"/>
+    <w:basedOn w:val="a"/>
+    <w:rsid w:val="00536AFB"/>
+    <w:pPr>
+      <w:spacing w:after="460" w:before="230" w:line="180" w:lineRule="exact"/>
+      <w:jc w:val="right"/>
+    </w:pPr>
+    <w:rPr>
+      <w:rFonts w:ascii="Arial" w:hAnsi="Arial"/>
+      <w:sz w:val="14"/>
+      <w:szCs w:val="16"/>
+    </w:rPr>
+  </w:style>
+  <w:style w:customStyle="1" w:styleId="References" w:type="paragraph">
+    <w:name w:val="References"/>
+    <w:basedOn w:val="a"/>
+    <w:rsid w:val="00B71641"/>
+    <w:pPr>
+      <w:spacing w:line="200" w:lineRule="exact"/>
+      <w:ind w:firstLine="0" w:firstLineChars="0"/>
+      <w:jc w:val="left"/>
+    </w:pPr>
+    <w:rPr>
+      <w:sz w:val="15"/>
+      <w:szCs w:val="14"/>
+      <w:lang w:val="en-GB"/>
+    </w:rPr>
+  </w:style>
+  <w:style w:customStyle="1" w:styleId="HExperimentalSection" w:type="paragraph">
+    <w:name w:val="HExperimental_Section"/>
+    <w:basedOn w:val="a"/>
+    <w:rsid w:val="00536AFB"/>
+    <w:pPr>
+      <w:spacing w:after="230" w:before="460" w:line="230" w:lineRule="atLeast"/>
+    </w:pPr>
+    <w:rPr>
+      <w:i/>
+      <w:szCs w:val="20"/>
+    </w:rPr>
+  </w:style>
+  <w:style w:customStyle="1" w:styleId="ExperimentalSection" w:type="paragraph">
+    <w:name w:val="ExperimentalSection"/>
+    <w:basedOn w:val="a"/>
+    <w:rsid w:val="00536AFB"/>
+    <w:pPr>
+      <w:spacing w:after="240" w:line="200" w:lineRule="exact"/>
+      <w:ind w:firstLine="170"/>
+    </w:pPr>
+    <w:rPr>
+      <w:sz w:val="16"/>
+      <w:szCs w:val="14"/>
+      <w:lang w:val="en-GB"/>
+    </w:rPr>
+  </w:style>
+  <w:style w:customStyle="1" w:styleId="FNB" w:type="paragraph">
+    <w:name w:val="FNB"/>
+    <w:basedOn w:val="a"/>
+    <w:link w:val="FNBChar"/>
+    <w:rsid w:val="00536AFB"/>
+    <w:pPr>
+      <w:widowControl w:val="0"/>
+      <w:spacing w:after="40" w:line="160" w:lineRule="exact"/>
+      <w:ind w:hanging="567" w:left="567" w:right="4434"/>
+    </w:pPr>
+    <w:rPr>
+      <w:rFonts w:ascii="Times" w:hAnsi="Times"/>
+      <w:sz w:val="14"/>
+      <w:szCs w:val="3276"/>
+      <w:lang w:eastAsia="de-DE" w:val="en-GB"/>
+    </w:rPr>
+  </w:style>
+  <w:style w:customStyle="1" w:styleId="FNBChar" w:type="character">
+    <w:name w:val="FNB Char"/>
+    <w:link w:val="FNB"/>
+    <w:rsid w:val="00536AFB"/>
+    <w:rPr>
+      <w:rFonts w:ascii="Times" w:eastAsia="宋体" w:hAnsi="Times"/>
+      <w:sz w:val="14"/>
+      <w:szCs w:val="3276"/>
+      <w:lang w:eastAsia="de-DE"/>
+    </w:rPr>
+  </w:style>
+  <w:style w:customStyle="1" w:styleId="Ack" w:type="paragraph">
+    <w:name w:val="Ack"/>
+    <w:basedOn w:val="a"/>
+    <w:rsid w:val="00536AFB"/>
+  </w:style>
+  <w:style w:customStyle="1" w:styleId="TableCaption" w:type="paragraph">
+    <w:name w:val="TableCaption"/>
+    <w:rsid w:val="00536AFB"/>
+    <w:pPr>
+      <w:spacing w:after="120"/>
+      <w:jc w:val="center"/>
+    </w:pPr>
+    <w:rPr>
+      <w:rFonts w:ascii="等线" w:eastAsia="黑体" w:hAnsi="等线"/>
+      <w:b/>
+      <w:sz w:val="21"/>
+      <w:szCs w:val="14"/>
+      <w:lang w:eastAsia="ja-JP"/>
+    </w:rPr>
+  </w:style>
+  <w:style w:customStyle="1" w:styleId="TableHead" w:type="paragraph">
+    <w:name w:val="TableHead"/>
+    <w:basedOn w:val="TableCaption"/>
+    <w:rsid w:val="00536AFB"/>
+    <w:pPr>
+      <w:pBdr>
+        <w:top w:color="FFFFFF" w:space="4" w:sz="4" w:val="single"/>
+        <w:left w:color="FFFFFF" w:space="4" w:sz="4" w:val="single"/>
+        <w:bottom w:color="FFFFFF" w:space="4" w:sz="4" w:val="single"/>
+        <w:right w:color="FFFFFF" w:space="4" w:sz="4" w:val="single"/>
+      </w:pBdr>
+      <w:spacing w:after="0"/>
+    </w:pPr>
+  </w:style>
+  <w:style w:customStyle="1" w:styleId="TableBody" w:type="paragraph">
+    <w:name w:val="TableBody"/>
+    <w:basedOn w:val="TableHead"/>
+    <w:rsid w:val="00B71641"/>
+    <w:rPr>
+      <w:rFonts w:ascii="Times New Roman" w:eastAsia="宋体" w:hAnsi="Times New Roman"/>
+      <w:b w:val="0"/>
+      <w:sz w:val="24"/>
+    </w:rPr>
+  </w:style>
+  <w:style w:customStyle="1" w:styleId="TableFoot" w:type="paragraph">
+    <w:name w:val="TableFoot"/>
+    <w:basedOn w:val="TableBody"/>
+    <w:rsid w:val="00536AFB"/>
+    <w:pPr>
+      <w:spacing w:after="60" w:before="60"/>
+    </w:pPr>
+    <w:rPr>
+      <w:sz w:val="18"/>
+    </w:rPr>
+  </w:style>
+  <w:style w:customStyle="1" w:styleId="SchemeCaption" w:type="paragraph">
+    <w:name w:val="SchemeCaption"/>
+    <w:basedOn w:val="a"/>
+    <w:rsid w:val="00536AFB"/>
+    <w:pPr>
+      <w:spacing w:after="460" w:before="230" w:line="190" w:lineRule="exact"/>
+    </w:pPr>
+    <w:rPr>
+      <w:rFonts w:ascii="Arial" w:hAnsi="Arial"/>
+      <w:sz w:val="16"/>
+      <w:szCs w:val="14"/>
+      <w:lang w:val="en-GB"/>
+    </w:rPr>
+  </w:style>
+  <w:style w:styleId="a3" w:type="paragraph">
+    <w:name w:val="footnote text"/>
+    <w:basedOn w:val="a"/>
+    <w:semiHidden/>
+    <w:rsid w:val="00D81375"/>
+    <w:pPr>
       <w:keepLines/>
-      <w:spacing w:after="0"/>
-    </w:pPr>
+      <w:widowControl w:val="0"/>
+    </w:pPr>
+    <w:rPr>
+      <w:rFonts w:eastAsia="Times New Roman"/>
+      <w:sz w:val="20"/>
+      <w:szCs w:val="20"/>
+      <w:lang w:eastAsia="ro-RO" w:val="en-GB"/>
+    </w:rPr>
+  </w:style>
+  <w:style w:customStyle="1" w:styleId="STOE" w:type="paragraph">
+    <w:name w:val="STOE"/>
+    <w:basedOn w:val="a"/>
+    <w:link w:val="STOEChar1"/>
+    <w:rsid w:val="00536AFB"/>
+    <w:pPr>
+      <w:widowControl w:val="0"/>
+      <w:spacing w:line="236" w:lineRule="exact"/>
+      <w:ind w:right="4434"/>
+    </w:pPr>
+    <w:rPr>
+      <w:rFonts w:ascii="Times" w:hAnsi="Times"/>
+      <w:sz w:val="18"/>
+      <w:szCs w:val="3276"/>
+      <w:lang w:eastAsia="de-DE" w:val="en-GB"/>
+    </w:rPr>
+  </w:style>
+  <w:style w:customStyle="1" w:styleId="STOEChar1" w:type="character">
+    <w:name w:val="STOE Char1"/>
+    <w:link w:val="STOE"/>
+    <w:rsid w:val="00536AFB"/>
+    <w:rPr>
+      <w:rFonts w:ascii="Times" w:eastAsia="宋体" w:hAnsi="Times"/>
+      <w:sz w:val="18"/>
+      <w:szCs w:val="3276"/>
+      <w:lang w:eastAsia="de-DE"/>
+    </w:rPr>
+  </w:style>
+  <w:style w:styleId="a4" w:type="paragraph">
+    <w:name w:val="Balloon Text"/>
+    <w:basedOn w:val="a"/>
+    <w:semiHidden/>
+    <w:rsid w:val="00D81375"/>
+    <w:rPr>
+      <w:rFonts w:ascii="Tahoma" w:cs="Tahoma" w:hAnsi="Tahoma"/>
+      <w:sz w:val="16"/>
+      <w:szCs w:val="16"/>
+    </w:rPr>
+  </w:style>
+  <w:style w:styleId="a5" w:type="paragraph">
+    <w:name w:val="header"/>
+    <w:basedOn w:val="a"/>
+    <w:link w:val="a6"/>
+    <w:rsid w:val="00881456"/>
+    <w:pPr>
+      <w:tabs>
+        <w:tab w:pos="4536" w:val="center"/>
+        <w:tab w:pos="9072" w:val="right"/>
+      </w:tabs>
+    </w:pPr>
+    <w:rPr>
+      <w:lang w:val="x-none"/>
+    </w:rPr>
+  </w:style>
+  <w:style w:styleId="a7" w:type="paragraph">
+    <w:name w:val="footer"/>
+    <w:basedOn w:val="a"/>
+    <w:link w:val="a8"/>
+    <w:uiPriority w:val="99"/>
+    <w:rsid w:val="00881456"/>
+    <w:pPr>
+      <w:tabs>
+        <w:tab w:pos="4536" w:val="center"/>
+        <w:tab w:pos="9072" w:val="right"/>
+      </w:tabs>
+    </w:pPr>
+  </w:style>
+  <w:style w:customStyle="1" w:styleId="Title1" w:type="paragraph">
+    <w:name w:val="Title1"/>
+    <w:basedOn w:val="a"/>
+    <w:rsid w:val="00536AFB"/>
     <w:rPr>
       <w:b/>
-    </w:rPr>
-  </w:style>
-  <w:style w:customStyle="1" w:styleId="Definition" w:type="paragraph">
-    <w:name w:val="Definition"/>
-    <w:basedOn w:val="Normal"/>
-  </w:style>
-  <w:style w:styleId="Caption" w:type="paragraph">
-    <w:name w:val="Caption"/>
-    <w:basedOn w:val="Normal"/>
-    <w:link w:val="BodyTextChar"/>
-    <w:pPr>
-      <w:spacing w:after="120" w:before="0"/>
-    </w:pPr>
-    <w:rPr>
+      <w:lang w:val="en-US"/>
+    </w:rPr>
+  </w:style>
+  <w:style w:customStyle="1" w:styleId="AuthorsFull" w:type="paragraph">
+    <w:name w:val="Authors Full"/>
+    <w:rsid w:val="004D6247"/>
+    <w:pPr>
+      <w:spacing w:line="360" w:lineRule="auto"/>
+      <w:jc w:val="center"/>
+    </w:pPr>
+    <w:rPr>
+      <w:rFonts w:ascii="Times" w:eastAsia="宋体" w:hAnsi="Times"/>
       <w:i/>
-    </w:rPr>
-  </w:style>
-  <w:style w:customStyle="1" w:styleId="TableCaption" w:type="paragraph">
-    <w:name w:val="Table Caption"/>
-    <w:basedOn w:val="Caption"/>
-    <w:pPr>
-      <w:keepNext/>
-    </w:pPr>
-  </w:style>
-  <w:style w:customStyle="1" w:styleId="ImageCaption" w:type="paragraph">
-    <w:name w:val="Image Caption"/>
-    <w:basedOn w:val="Caption"/>
-  </w:style>
-  <w:style w:customStyle="1" w:styleId="Figure" w:type="paragraph">
-    <w:name w:val="Figure"/>
-    <w:basedOn w:val="Normal"/>
-  </w:style>
-  <w:style w:customStyle="1" w:styleId="CaptionedFigure" w:type="paragraph">
-    <w:name w:val="Captioned Figure"/>
-    <w:basedOn w:val="Figure"/>
-    <w:pPr>
-      <w:keepNext/>
-    </w:pPr>
-  </w:style>
-  <w:style w:customStyle="1" w:styleId="BodyTextChar" w:type="character">
-    <w:name w:val="Body Text Char"/>
-    <w:basedOn w:val="DefaultParagraphFont"/>
-    <w:link w:val="BodyText"/>
-  </w:style>
-  <w:style w:customStyle="1" w:styleId="VerbatimChar" w:type="character">
-    <w:name w:val="Verbatim Char"/>
-    <w:basedOn w:val="BodyTextChar"/>
-    <w:rPr>
-      <w:rFonts w:ascii="Consolas" w:hAnsi="Consolas"/>
-      <w:sz w:val="22"/>
-    </w:rPr>
-  </w:style>
-  <w:style w:customStyle="1" w:styleId="SectionNumber" w:type="character">
-    <w:name w:val="Section Number"/>
-    <w:basedOn w:val="BodyTextChar"/>
-  </w:style>
-  <w:style w:styleId="FootnoteReference" w:type="character">
-    <w:name w:val="Footnote Reference"/>
-    <w:basedOn w:val="BodyTextChar"/>
-    <w:rPr>
-      <w:vertAlign w:val="superscript"/>
-    </w:rPr>
-  </w:style>
-  <w:style w:styleId="Hyperlink" w:type="character">
-    <w:name w:val="Hyperlink"/>
-    <w:basedOn w:val="BodyTextChar"/>
-    <w:rPr>
-      <w:color w:themeColor="accent1" w:val="4F81BD"/>
-    </w:rPr>
-  </w:style>
-  <w:style w:styleId="TOCHeading" w:type="paragraph">
-    <w:name w:val="TOC Heading"/>
-    <w:basedOn w:val="Heading1"/>
-    <w:next w:val="BodyText"/>
-    <w:uiPriority w:val="39"/>
+      <w:sz w:val="18"/>
+      <w:szCs w:val="3276"/>
+      <w:lang w:eastAsia="de-DE" w:val="en-US"/>
+    </w:rPr>
+  </w:style>
+  <w:style w:customStyle="1" w:styleId="dedication" w:type="paragraph">
+    <w:name w:val="dedication"/>
+    <w:basedOn w:val="a"/>
+    <w:rsid w:val="00536AFB"/>
+    <w:rPr>
+      <w:i/>
+      <w:lang w:val="en-US"/>
+    </w:rPr>
+  </w:style>
+  <w:style w:customStyle="1" w:styleId="Addresses" w:type="paragraph">
+    <w:name w:val="Addresses"/>
+    <w:basedOn w:val="a"/>
+    <w:rsid w:val="00536AFB"/>
+    <w:rPr>
+      <w:sz w:val="18"/>
+      <w:lang w:val="en-US"/>
+    </w:rPr>
+  </w:style>
+  <w:style w:customStyle="1" w:styleId="Acknowledgements" w:type="paragraph">
+    <w:name w:val="Acknowledgements"/>
+    <w:basedOn w:val="a"/>
+    <w:rsid w:val="00536AFB"/>
+    <w:rPr>
+      <w:lang w:val="en-US"/>
+    </w:rPr>
+  </w:style>
+  <w:style w:customStyle="1" w:styleId="Abstract" w:type="paragraph">
+    <w:name w:val="Abstract"/>
+    <w:autoRedefine/>
+    <w:rsid w:val="00536AFB"/>
+    <w:pPr>
+      <w:spacing w:line="360" w:lineRule="auto"/>
+      <w:ind w:left="400" w:leftChars="400" w:right="400" w:rightChars="400"/>
+      <w:jc w:val="both"/>
+    </w:pPr>
+    <w:rPr>
+      <w:rFonts w:eastAsia="楷体"/>
+      <w:sz w:val="24"/>
+      <w:szCs w:val="24"/>
+      <w:lang w:eastAsia="ja-JP" w:val="en-US"/>
+    </w:rPr>
+  </w:style>
+  <w:style w:customStyle="1" w:styleId="Head1" w:type="paragraph">
+    <w:name w:val="Head 1"/>
+    <w:basedOn w:val="a"/>
+    <w:autoRedefine/>
+    <w:rsid w:val="00536AFB"/>
+    <w:rPr>
+      <w:b/>
+      <w:lang w:val="en-US"/>
+    </w:rPr>
+  </w:style>
+  <w:style w:customStyle="1" w:styleId="Head2" w:type="paragraph">
+    <w:name w:val="Head 2"/>
+    <w:basedOn w:val="a"/>
+    <w:autoRedefine/>
+    <w:rsid w:val="00536AFB"/>
+    <w:rPr>
+      <w:i/>
+      <w:lang w:val="en-US"/>
+    </w:rPr>
+  </w:style>
+  <w:style w:customStyle="1" w:styleId="dates" w:type="paragraph">
+    <w:name w:val="dates"/>
+    <w:basedOn w:val="a"/>
+    <w:rsid w:val="00536AFB"/>
+    <w:pPr>
+      <w:jc w:val="right"/>
+    </w:pPr>
+    <w:rPr>
+      <w:lang w:val="en-US"/>
+    </w:rPr>
+  </w:style>
+  <w:style w:customStyle="1" w:styleId="Literature" w:type="paragraph">
+    <w:name w:val="Literature"/>
+    <w:basedOn w:val="a"/>
+    <w:rsid w:val="00536AFB"/>
+    <w:pPr>
+      <w:spacing w:line="480" w:lineRule="auto"/>
+    </w:pPr>
+  </w:style>
+  <w:style w:customStyle="1" w:styleId="Legend" w:type="paragraph">
+    <w:name w:val="Legend"/>
+    <w:basedOn w:val="a"/>
+    <w:rsid w:val="00536AFB"/>
+    <w:rPr>
+      <w:lang w:val="en-US"/>
+    </w:rPr>
+  </w:style>
+  <w:style w:customStyle="1" w:styleId="MainText" w:type="paragraph">
+    <w:name w:val="Main Text"/>
+    <w:basedOn w:val="a"/>
+    <w:link w:val="MainTextChar"/>
+    <w:rsid w:val="00536AFB"/>
+    <w:pPr>
+      <w:spacing w:line="480" w:lineRule="auto"/>
+    </w:pPr>
+    <w:rPr>
+      <w:lang w:val="en-US"/>
+    </w:rPr>
+  </w:style>
+  <w:style w:customStyle="1" w:styleId="Tableofcontents" w:type="paragraph">
+    <w:name w:val="Table of contents"/>
+    <w:autoRedefine/>
+    <w:rsid w:val="00536AFB"/>
+    <w:pPr>
+      <w:jc w:val="center"/>
+    </w:pPr>
+    <w:rPr>
+      <w:rFonts w:eastAsia="宋体"/>
+      <w:sz w:val="21"/>
+      <w:szCs w:val="24"/>
+      <w:lang w:eastAsia="ja-JP" w:val="en-US"/>
+    </w:rPr>
+  </w:style>
+  <w:style w:customStyle="1" w:styleId="ExperimentalText" w:type="paragraph">
+    <w:name w:val="Experimental Text"/>
+    <w:basedOn w:val="a"/>
+    <w:link w:val="ExperimentalTextChar"/>
+    <w:rsid w:val="00536AFB"/>
+    <w:pPr>
+      <w:spacing w:line="480" w:lineRule="auto"/>
+    </w:pPr>
+    <w:rPr>
+      <w:lang w:val="en-US"/>
+    </w:rPr>
+  </w:style>
+  <w:style w:customStyle="1" w:styleId="ExperimentalTextChar" w:type="character">
+    <w:name w:val="Experimental Text Char"/>
+    <w:link w:val="ExperimentalText"/>
+    <w:rsid w:val="00536AFB"/>
+    <w:rPr>
+      <w:rFonts w:eastAsia="宋体"/>
+      <w:sz w:val="24"/>
+      <w:szCs w:val="24"/>
+      <w:lang w:eastAsia="ja-JP" w:val="en-US"/>
+    </w:rPr>
+  </w:style>
+  <w:style w:customStyle="1" w:styleId="MainTextChar" w:type="character">
+    <w:name w:val="Main Text Char"/>
+    <w:link w:val="MainText"/>
+    <w:rsid w:val="00536AFB"/>
+    <w:rPr>
+      <w:rFonts w:eastAsia="宋体"/>
+      <w:sz w:val="24"/>
+      <w:szCs w:val="24"/>
+      <w:lang w:eastAsia="ja-JP" w:val="en-US"/>
+    </w:rPr>
+  </w:style>
+  <w:style w:customStyle="1" w:styleId="Title2" w:type="paragraph">
+    <w:name w:val="Title2"/>
+    <w:basedOn w:val="a"/>
+    <w:rsid w:val="00536AFB"/>
+    <w:rPr>
+      <w:b/>
+      <w:lang w:val="en-US"/>
+    </w:rPr>
+  </w:style>
+  <w:style w:customStyle="1" w:styleId="Dedication0" w:type="paragraph">
+    <w:name w:val="Dedication"/>
+    <w:basedOn w:val="a"/>
+    <w:autoRedefine/>
+    <w:rsid w:val="00536AFB"/>
+    <w:rPr>
+      <w:lang w:val="en-US"/>
+    </w:rPr>
+  </w:style>
+  <w:style w:customStyle="1" w:styleId="Maintext0" w:type="paragraph">
+    <w:name w:val="Main text"/>
+    <w:basedOn w:val="a"/>
+    <w:link w:val="MaintextChar0"/>
+    <w:autoRedefine/>
+    <w:rsid w:val="00536AFB"/>
+    <w:pPr>
+      <w:spacing w:line="480" w:lineRule="auto"/>
+    </w:pPr>
+    <w:rPr>
+      <w:lang w:val="en-US"/>
+    </w:rPr>
+  </w:style>
+  <w:style w:customStyle="1" w:styleId="MaintextChar0" w:type="character">
+    <w:name w:val="Main text Char"/>
+    <w:link w:val="Maintext0"/>
+    <w:rsid w:val="00536AFB"/>
+    <w:rPr>
+      <w:rFonts w:eastAsia="宋体"/>
+      <w:sz w:val="24"/>
+      <w:szCs w:val="24"/>
+      <w:lang w:eastAsia="ja-JP" w:val="en-US"/>
+    </w:rPr>
+  </w:style>
+  <w:style w:customStyle="1" w:styleId="Biography" w:type="paragraph">
+    <w:name w:val="Biography"/>
+    <w:basedOn w:val="a"/>
+    <w:autoRedefine/>
+    <w:rsid w:val="00536AFB"/>
+    <w:rPr>
+      <w:i/>
+      <w:lang w:val="en-US"/>
+    </w:rPr>
+  </w:style>
+  <w:style w:customStyle="1" w:styleId="a6" w:type="character">
+    <w:name w:val="页眉 字符"/>
+    <w:link w:val="a5"/>
+    <w:rsid w:val="00414465"/>
+    <w:rPr>
+      <w:sz w:val="24"/>
+      <w:szCs w:val="24"/>
+      <w:lang w:eastAsia="ja-JP"/>
+    </w:rPr>
+  </w:style>
+  <w:style w:styleId="a9" w:type="character">
+    <w:name w:val="annotation reference"/>
+    <w:uiPriority w:val="99"/>
+    <w:semiHidden/>
+    <w:unhideWhenUsed/>
+    <w:rsid w:val="00664F6D"/>
+    <w:rPr>
+      <w:sz w:val="16"/>
+      <w:szCs w:val="16"/>
+    </w:rPr>
+  </w:style>
+  <w:style w:styleId="aa" w:type="paragraph">
+    <w:name w:val="annotation text"/>
+    <w:basedOn w:val="a"/>
+    <w:link w:val="ab"/>
+    <w:uiPriority w:val="99"/>
+    <w:semiHidden/>
+    <w:unhideWhenUsed/>
+    <w:rsid w:val="00664F6D"/>
+    <w:rPr>
+      <w:sz w:val="20"/>
+      <w:szCs w:val="20"/>
+      <w:lang w:val="x-none"/>
+    </w:rPr>
+  </w:style>
+  <w:style w:customStyle="1" w:styleId="ab" w:type="character">
+    <w:name w:val="批注文字 字符"/>
+    <w:link w:val="aa"/>
+    <w:uiPriority w:val="99"/>
+    <w:semiHidden/>
+    <w:rsid w:val="00664F6D"/>
+    <w:rPr>
+      <w:lang w:eastAsia="ja-JP"/>
+    </w:rPr>
+  </w:style>
+  <w:style w:styleId="ac" w:type="paragraph">
+    <w:name w:val="annotation subject"/>
+    <w:basedOn w:val="aa"/>
+    <w:next w:val="aa"/>
+    <w:link w:val="ad"/>
+    <w:uiPriority w:val="99"/>
+    <w:semiHidden/>
+    <w:unhideWhenUsed/>
+    <w:rsid w:val="00664F6D"/>
+    <w:rPr>
+      <w:b/>
+      <w:bCs/>
+    </w:rPr>
+  </w:style>
+  <w:style w:customStyle="1" w:styleId="ad" w:type="character">
+    <w:name w:val="批注主题 字符"/>
+    <w:link w:val="ac"/>
+    <w:uiPriority w:val="99"/>
+    <w:semiHidden/>
+    <w:rsid w:val="00664F6D"/>
+    <w:rPr>
+      <w:b/>
+      <w:bCs/>
+      <w:lang w:eastAsia="ja-JP"/>
+    </w:rPr>
+  </w:style>
+  <w:style w:customStyle="1" w:styleId="a8" w:type="character">
+    <w:name w:val="页脚 字符"/>
+    <w:link w:val="a7"/>
+    <w:uiPriority w:val="99"/>
+    <w:rsid w:val="007B7A09"/>
+    <w:rPr>
+      <w:sz w:val="24"/>
+      <w:szCs w:val="24"/>
+      <w:lang w:eastAsia="ja-JP"/>
+    </w:rPr>
+  </w:style>
+  <w:style w:customStyle="1" w:styleId="10" w:type="character">
+    <w:name w:val="标题 1 字符"/>
+    <w:basedOn w:val="a0"/>
+    <w:link w:val="1"/>
+    <w:uiPriority w:val="9"/>
+    <w:rsid w:val="004363EA"/>
+    <w:rPr>
+      <w:b/>
+      <w:noProof/>
+      <w:sz w:val="32"/>
+      <w:szCs w:val="24"/>
+      <w:lang w:eastAsia="ja-JP" w:val="en-US"/>
+    </w:rPr>
+  </w:style>
+  <w:style w:customStyle="1" w:styleId="20" w:type="character">
+    <w:name w:val="标题 2 字符"/>
+    <w:basedOn w:val="a0"/>
+    <w:link w:val="2"/>
+    <w:uiPriority w:val="9"/>
+    <w:rsid w:val="00536AFB"/>
+    <w:rPr>
+      <w:rFonts w:eastAsia="宋体"/>
+      <w:b/>
+      <w:noProof/>
+      <w:sz w:val="30"/>
+      <w:szCs w:val="24"/>
+      <w:lang w:eastAsia="ja-JP" w:val="en-US"/>
+    </w:rPr>
+  </w:style>
+  <w:style w:customStyle="1" w:styleId="30" w:type="character">
+    <w:name w:val="标题 3 字符"/>
+    <w:basedOn w:val="a0"/>
+    <w:link w:val="3"/>
+    <w:uiPriority w:val="9"/>
+    <w:rsid w:val="00536AFB"/>
+    <w:rPr>
+      <w:rFonts w:eastAsia="宋体"/>
+      <w:b/>
+      <w:sz w:val="24"/>
+      <w:szCs w:val="24"/>
+      <w:lang w:eastAsia="ja-JP" w:val="de-DE"/>
+    </w:rPr>
+  </w:style>
+  <w:style w:customStyle="1" w:styleId="11" w:type="paragraph">
+    <w:name w:val="题注1"/>
+    <w:next w:val="a"/>
+    <w:link w:val="caption"/>
+    <w:rsid w:val="00E77B24"/>
+    <w:pPr>
+      <w:jc w:val="center"/>
+    </w:pPr>
+    <w:rPr>
+      <w:rFonts w:eastAsia="黑体"/>
+      <w:b/>
+      <w:noProof/>
+      <w:sz w:val="21"/>
+      <w:szCs w:val="24"/>
+      <w:lang w:eastAsia="ja-JP" w:val="en-US"/>
+    </w:rPr>
+  </w:style>
+  <w:style w:styleId="ae" w:type="paragraph">
+    <w:name w:val="caption"/>
+    <w:next w:val="a"/>
+    <w:uiPriority w:val="35"/>
     <w:unhideWhenUsed/>
     <w:qFormat/>
-    <w:pPr>
-      <w:spacing w:before="240" w:line="259" w:lineRule="auto"/>
-      <w:outlineLvl w:val="9"/>
-    </w:pPr>
-    <w:rPr>
-      <w:rFonts w:asciiTheme="majorHAnsi" w:cstheme="majorBidi" w:eastAsiaTheme="majorEastAsia" w:hAnsiTheme="majorHAnsi"/>
-      <w:b w:val="0"/>
-      <w:bCs w:val="0"/>
-      <w:color w:themeColor="accent1" w:themeShade="BF" w:val="365F91"/>
+    <w:rsid w:val="00E66330"/>
+    <w:pPr>
+      <w:spacing w:after="50" w:afterLines="50"/>
+      <w:jc w:val="center"/>
+    </w:pPr>
+    <w:rPr>
+      <w:rFonts w:ascii="等线" w:eastAsia="黑体" w:hAnsi="等线"/>
+      <w:sz w:val="21"/>
+      <w:szCs w:val="24"/>
+      <w:lang w:eastAsia="ja-JP" w:val="de-DE"/>
+    </w:rPr>
+  </w:style>
+  <w:style w:customStyle="1" w:styleId="caption" w:type="character">
+    <w:name w:val="caption 字符"/>
+    <w:basedOn w:val="10"/>
+    <w:link w:val="11"/>
+    <w:rsid w:val="00E77B24"/>
+    <w:rPr>
+      <w:rFonts w:eastAsia="黑体"/>
+      <w:b/>
+      <w:noProof/>
+      <w:sz w:val="21"/>
+      <w:szCs w:val="24"/>
+      <w:lang w:eastAsia="ja-JP" w:val="en-US"/>
+    </w:rPr>
+  </w:style>
+  <w:style w:styleId="af" w:type="paragraph">
+    <w:name w:val="Title"/>
+    <w:next w:val="a"/>
+    <w:link w:val="af0"/>
+    <w:uiPriority w:val="10"/>
+    <w:qFormat/>
+    <w:rsid w:val="00536AFB"/>
+    <w:pPr>
+      <w:spacing w:after="60" w:before="240" w:line="360" w:lineRule="auto"/>
+      <w:jc w:val="center"/>
+    </w:pPr>
+    <w:rPr>
+      <w:rFonts w:cstheme="majorBidi" w:eastAsia="黑体"/>
+      <w:b/>
+      <w:bCs/>
+      <w:sz w:val="32"/>
+      <w:szCs w:val="32"/>
+      <w:lang w:eastAsia="ja-JP" w:val="de-DE"/>
+    </w:rPr>
+  </w:style>
+  <w:style w:customStyle="1" w:styleId="af0" w:type="character">
+    <w:name w:val="标题 字符"/>
+    <w:basedOn w:val="a0"/>
+    <w:link w:val="af"/>
+    <w:uiPriority w:val="10"/>
+    <w:rsid w:val="00536AFB"/>
+    <w:rPr>
+      <w:rFonts w:cstheme="majorBidi" w:eastAsia="黑体"/>
+      <w:b/>
+      <w:bCs/>
+      <w:sz w:val="32"/>
+      <w:szCs w:val="32"/>
+      <w:lang w:eastAsia="ja-JP" w:val="de-DE"/>
+    </w:rPr>
+  </w:style>
+  <w:style w:customStyle="1" w:styleId="TableBody056" w:type="paragraph">
+    <w:name w:val="样式 TableBody + 首行缩进:  0.56 厘米"/>
+    <w:basedOn w:val="TableBody"/>
+    <w:rsid w:val="00FE6E94"/>
+    <w:rPr>
+      <w:rFonts w:cs="宋体"/>
+      <w:szCs w:val="20"/>
+    </w:rPr>
+  </w:style>
+  <w:style w:customStyle="1" w:styleId="TableBody085" w:type="paragraph">
+    <w:name w:val="样式 TableBody + 首行缩进:  0.85 厘米"/>
+    <w:basedOn w:val="TableBody"/>
+    <w:rsid w:val="00FE6E94"/>
+    <w:rPr>
+      <w:rFonts w:cs="宋体"/>
+      <w:szCs w:val="20"/>
+    </w:rPr>
+  </w:style>
+  <w:style w:customStyle="1" w:styleId="FigureCaption" w:type="paragraph">
+    <w:name w:val="FigureCaption"/>
+    <w:next w:val="a"/>
+    <w:qFormat/>
+    <w:rsid w:val="00536AFB"/>
+    <w:pPr>
+      <w:jc w:val="center"/>
+    </w:pPr>
+    <w:rPr>
+      <w:rFonts w:cstheme="majorBidi" w:eastAsia="宋体"/>
+      <w:b/>
+      <w:bCs/>
+      <w:sz w:val="21"/>
+      <w:szCs w:val="32"/>
+      <w:lang w:eastAsia="ja-JP" w:val="de-DE"/>
+    </w:rPr>
+  </w:style>
+  <w:style w:styleId="af1" w:type="paragraph">
+    <w:name w:val="No Spacing"/>
+    <w:uiPriority w:val="1"/>
+    <w:qFormat/>
+    <w:rsid w:val="002D4E76"/>
+    <w:pPr>
+      <w:ind w:firstLine="200" w:firstLineChars="200"/>
+      <w:jc w:val="both"/>
+    </w:pPr>
+    <w:rPr>
+      <w:rFonts w:eastAsia="宋体"/>
+      <w:sz w:val="24"/>
+      <w:szCs w:val="24"/>
+      <w:lang w:eastAsia="ja-JP" w:val="de-DE"/>
+    </w:rPr>
+  </w:style>
+  <w:style w:styleId="af2" w:type="paragraph">
+    <w:name w:val="List Paragraph"/>
+    <w:basedOn w:val="a"/>
+    <w:uiPriority w:val="34"/>
+    <w:qFormat/>
+    <w:rsid w:val="002D4E76"/>
+    <w:pPr>
+      <w:ind w:firstLine="420"/>
+    </w:pPr>
+  </w:style>
+  <w:style w:styleId="af3" w:type="paragraph">
+    <w:name w:val="Quote"/>
+    <w:basedOn w:val="a"/>
+    <w:next w:val="a"/>
+    <w:link w:val="af4"/>
+    <w:uiPriority w:val="29"/>
+    <w:qFormat/>
+    <w:rsid w:val="002D4E76"/>
+    <w:pPr>
+      <w:spacing w:after="160" w:before="200"/>
+      <w:ind w:left="864" w:right="864"/>
+      <w:jc w:val="center"/>
+    </w:pPr>
+    <w:rPr>
+      <w:i/>
+      <w:iCs/>
+      <w:color w:themeColor="text1" w:themeTint="BF" w:val="404040"/>
+    </w:rPr>
+  </w:style>
+  <w:style w:customStyle="1" w:styleId="af4" w:type="character">
+    <w:name w:val="引用 字符"/>
+    <w:basedOn w:val="a0"/>
+    <w:link w:val="af3"/>
+    <w:uiPriority w:val="29"/>
+    <w:rsid w:val="002D4E76"/>
+    <w:rPr>
+      <w:rFonts w:eastAsia="宋体"/>
+      <w:i/>
+      <w:iCs/>
+      <w:color w:themeColor="text1" w:themeTint="BF" w:val="404040"/>
+      <w:sz w:val="24"/>
+      <w:szCs w:val="24"/>
+      <w:lang w:eastAsia="ja-JP" w:val="de-DE"/>
     </w:rPr>
   </w:style>
   <w:style w:type="paragraph" w:customStyle="1" w:styleId="SourceCode">
@@ -1885,39 +2910,39 @@
         <a:sysClr val="window" lastClr="FFFFFF"/>
       </a:lt1>
       <a:dk2>
-        <a:srgbClr val="0E2841"/>
+        <a:srgbClr val="44546A"/>
       </a:dk2>
       <a:lt2>
-        <a:srgbClr val="E8E8E8"/>
+        <a:srgbClr val="E7E6E6"/>
       </a:lt2>
       <a:accent1>
-        <a:srgbClr val="156082"/>
+        <a:srgbClr val="4472C4"/>
       </a:accent1>
       <a:accent2>
-        <a:srgbClr val="E97132"/>
+        <a:srgbClr val="ED7D31"/>
       </a:accent2>
       <a:accent3>
-        <a:srgbClr val="196B24"/>
+        <a:srgbClr val="A5A5A5"/>
       </a:accent3>
       <a:accent4>
-        <a:srgbClr val="0F9ED5"/>
+        <a:srgbClr val="FFC000"/>
       </a:accent4>
       <a:accent5>
-        <a:srgbClr val="A02B93"/>
+        <a:srgbClr val="5B9BD5"/>
       </a:accent5>
       <a:accent6>
-        <a:srgbClr val="4EA72E"/>
+        <a:srgbClr val="70AD47"/>
       </a:accent6>
       <a:hlink>
-        <a:srgbClr val="467886"/>
+        <a:srgbClr val="0563C1"/>
       </a:hlink>
       <a:folHlink>
-        <a:srgbClr val="96607D"/>
+        <a:srgbClr val="954F72"/>
       </a:folHlink>
     </a:clrScheme>
     <a:fontScheme name="Office">
       <a:majorFont>
-        <a:latin typeface="Aptos Display" panose="02110004020202020204"/>
+        <a:latin typeface="Calibri Light" panose="020F0302020204030204"/>
         <a:ea typeface=""/>
         <a:cs typeface=""/>
         <a:font script="Jpan" typeface="游ゴシック Light"/>
@@ -1969,7 +2994,7 @@
         <a:font script="Tfng" typeface="Ebrima"/>
       </a:majorFont>
       <a:minorFont>
-        <a:latin typeface="Aptos" panose="02110004020202020204"/>
+        <a:latin typeface="Calibri" panose="020F0502020204030204"/>
         <a:ea typeface=""/>
         <a:cs typeface=""/>
         <a:font script="Jpan" typeface="游明朝"/>
@@ -2163,7 +3188,7 @@
   <a:extraClrSchemeLst/>
   <a:extLst>
     <a:ext uri="{05A4C25C-085E-4340-85A3-A5531E510DB2}">
-      <thm15:themeFamily xmlns:thm15="http://schemas.microsoft.com/office/thememl/2012/main" name="Office Theme" id="{2E142A2C-CD16-42D6-873A-C26D2A0506FA}" vid="{1BDDFF52-6CD6-40A5-AB3C-68EB2F1E4D0A}"/>
+      <thm15:themeFamily xmlns:thm15="http://schemas.microsoft.com/office/thememl/2012/main" name="Office Theme" id="{62F939B6-93AF-4DB8-9C6B-D6C7DFDC589F}" vid="{4A3C46E8-61CC-4603-A589-7422A47A8E4A}"/>
     </a:ext>
   </a:extLst>
 </a:theme>

</xml_diff>

<commit_message>
feat: add demo PDF and converted Word document to examples directory
</commit_message>
<xml_diff>
--- a/examples/demo_word.docx
+++ b/examples/demo_word.docx
@@ -149,15 +149,6 @@
         <w:pStyle w:val="1"/>
       </w:pPr>
       <w:r>
-        <w:rPr>
-          <w:rStyle w:val="SectionNumber"/>
-        </w:rPr>
-        <w:t xml:space="preserve">1</w:t>
-      </w:r>
-      <w:r>
-        <w:tab/>
-      </w:r>
-      <w:r>
         <w:t xml:space="preserve">Introduction</w:t>
       </w:r>
     </w:p>
@@ -186,15 +177,6 @@
       <w:pPr>
         <w:pStyle w:val="2"/>
       </w:pPr>
-      <w:r>
-        <w:rPr>
-          <w:rStyle w:val="SectionNumber"/>
-        </w:rPr>
-        <w:t xml:space="preserve">1.1</w:t>
-      </w:r>
-      <w:r>
-        <w:tab/>
-      </w:r>
       <w:r>
         <w:t xml:space="preserve">Acronyms</w:t>
       </w:r>
@@ -214,15 +196,6 @@
       <w:pPr>
         <w:pStyle w:val="1"/>
       </w:pPr>
-      <w:r>
-        <w:rPr>
-          <w:rStyle w:val="SectionNumber"/>
-        </w:rPr>
-        <w:t xml:space="preserve">2</w:t>
-      </w:r>
-      <w:r>
-        <w:tab/>
-      </w:r>
       <w:r>
         <w:t xml:space="preserve">TikZ Diagrams</w:t>
       </w:r>
@@ -296,15 +269,6 @@
       <w:pPr>
         <w:pStyle w:val="1"/>
       </w:pPr>
-      <w:r>
-        <w:rPr>
-          <w:rStyle w:val="SectionNumber"/>
-        </w:rPr>
-        <w:t xml:space="preserve">3</w:t>
-      </w:r>
-      <w:r>
-        <w:tab/>
-      </w:r>
       <w:r>
         <w:t xml:space="preserve">Equations</w:t>
       </w:r>
@@ -624,15 +588,6 @@
         <w:pStyle w:val="1"/>
       </w:pPr>
       <w:r>
-        <w:rPr>
-          <w:rStyle w:val="SectionNumber"/>
-        </w:rPr>
-        <w:t xml:space="preserve">4</w:t>
-      </w:r>
-      <w:r>
-        <w:tab/>
-      </w:r>
-      <w:r>
         <w:t xml:space="preserve">Formatting</w:t>
       </w:r>
     </w:p>
@@ -717,15 +672,6 @@
       <w:pPr>
         <w:pStyle w:val="1"/>
       </w:pPr>
-      <w:r>
-        <w:rPr>
-          <w:rStyle w:val="SectionNumber"/>
-        </w:rPr>
-        <w:t xml:space="preserve">5</w:t>
-      </w:r>
-      <w:r>
-        <w:tab/>
-      </w:r>
       <w:r>
         <w:t xml:space="preserve">Conclusion</w:t>
       </w:r>

</xml_diff>